<commit_message>
Cambios y mejorar en la memoria
</commit_message>
<xml_diff>
--- a/Documentacion/Proyecto Intermodular.docx
+++ b/Documentacion/Proyecto Intermodular.docx
@@ -138,7 +138,7 @@
                     </pic:cNvPicPr>
                   </pic:nvPicPr>
                   <pic:blipFill rotWithShape="1">
-                    <a:blip r:embed="rId7" cstate="print">
+                    <a:blip r:embed="rId8" cstate="print">
                       <a:extLst>
                         <a:ext uri="{28A0092B-C50C-407E-A947-70E740481C1C}">
                           <a14:useLocalDpi xmlns:a14="http://schemas.microsoft.com/office/drawing/2010/main" val="0"/>
@@ -185,6 +185,7 @@
         <w:jc w:val="both"/>
         <w:rPr>
           <w:b/>
+          <w:i/>
           <w:color w:val="44546A" w:themeColor="text2"/>
           <w:sz w:val="28"/>
         </w:rPr>
@@ -192,6 +193,7 @@
       <w:r>
         <w:rPr>
           <w:b/>
+          <w:i/>
           <w:color w:val="44546A" w:themeColor="text2"/>
           <w:sz w:val="28"/>
         </w:rPr>
@@ -244,7 +246,7 @@
         <w:rPr>
           <w:color w:val="002060"/>
         </w:rPr>
-        <w:t>Necesitan una aplicación informática para gestionar de forma eficiente los jugadores, los partidos, los resultados y la clasificación en tiempo real. Además, el sistema debe incluir un control de alertas que avise automáticamente cuando una pista ya esté reservada para evitar confusiones.</w:t>
+        <w:t>Necesitan una aplicación informática para gestionar de forma eficiente los jugadores, los partidos, los resultados y la clasificación en tiempo real. Además, el sistema debe incluir un control de alertas que avise automáticamente cuando una pista ya esté reservada para evitar confusiones</w:t>
       </w:r>
     </w:p>
     <w:p>
@@ -297,7 +299,7 @@
                     </pic:cNvPicPr>
                   </pic:nvPicPr>
                   <pic:blipFill>
-                    <a:blip r:embed="rId8" cstate="print">
+                    <a:blip r:embed="rId9" cstate="print">
                       <a:extLst>
                         <a:ext uri="{28A0092B-C50C-407E-A947-70E740481C1C}">
                           <a14:useLocalDpi xmlns:a14="http://schemas.microsoft.com/office/drawing/2010/main" val="0"/>
@@ -498,10 +500,10 @@
           <wp:anchor distT="0" distB="0" distL="114300" distR="114300" simplePos="0" relativeHeight="251659264" behindDoc="0" locked="0" layoutInCell="1" allowOverlap="1">
             <wp:simplePos x="0" y="0"/>
             <wp:positionH relativeFrom="margin">
-              <wp:posOffset>4029811</wp:posOffset>
+              <wp:posOffset>4022395</wp:posOffset>
             </wp:positionH>
             <wp:positionV relativeFrom="margin">
-              <wp:posOffset>6795770</wp:posOffset>
+              <wp:posOffset>6868922</wp:posOffset>
             </wp:positionV>
             <wp:extent cx="2346325" cy="1272540"/>
             <wp:effectExtent l="19050" t="0" r="15875" b="403860"/>
@@ -520,7 +522,7 @@
                     </pic:cNvPicPr>
                   </pic:nvPicPr>
                   <pic:blipFill>
-                    <a:blip r:embed="rId9" cstate="print">
+                    <a:blip r:embed="rId10" cstate="print">
                       <a:extLst>
                         <a:ext uri="{28A0092B-C50C-407E-A947-70E740481C1C}">
                           <a14:useLocalDpi xmlns:a14="http://schemas.microsoft.com/office/drawing/2010/main" val="0"/>
@@ -726,7 +728,7 @@
                     </pic:cNvPicPr>
                   </pic:nvPicPr>
                   <pic:blipFill>
-                    <a:blip r:embed="rId10" cstate="print">
+                    <a:blip r:embed="rId11" cstate="print">
                       <a:extLst>
                         <a:ext uri="{28A0092B-C50C-407E-A947-70E740481C1C}">
                           <a14:useLocalDpi xmlns:a14="http://schemas.microsoft.com/office/drawing/2010/main" val="0"/>
@@ -904,7 +906,7 @@
                     </pic:cNvPicPr>
                   </pic:nvPicPr>
                   <pic:blipFill>
-                    <a:blip r:embed="rId11" cstate="print">
+                    <a:blip r:embed="rId12" cstate="print">
                       <a:extLst>
                         <a:ext uri="{28A0092B-C50C-407E-A947-70E740481C1C}">
                           <a14:useLocalDpi xmlns:a14="http://schemas.microsoft.com/office/drawing/2010/main" val="0"/>
@@ -1077,6 +1079,103 @@
     </w:p>
     <w:p>
       <w:pPr>
+        <w:pStyle w:val="Ttulo1"/>
+        <w:spacing w:after="240" w:line="240" w:lineRule="auto"/>
+        <w:jc w:val="both"/>
+        <w:rPr>
+          <w:b/>
+          <w:color w:val="44546A" w:themeColor="text2"/>
+          <w:sz w:val="40"/>
+        </w:rPr>
+      </w:pPr>
+      <w:r>
+        <w:rPr>
+          <w:noProof/>
+          <w:color w:val="002060"/>
+        </w:rPr>
+        <w:drawing>
+          <wp:anchor distT="0" distB="0" distL="114300" distR="114300" simplePos="0" relativeHeight="251663360" behindDoc="0" locked="0" layoutInCell="1" allowOverlap="1" wp14:anchorId="21419D7C">
+            <wp:simplePos x="0" y="0"/>
+            <wp:positionH relativeFrom="margin">
+              <wp:posOffset>5107305</wp:posOffset>
+            </wp:positionH>
+            <wp:positionV relativeFrom="margin">
+              <wp:posOffset>4522470</wp:posOffset>
+            </wp:positionV>
+            <wp:extent cx="1184910" cy="1542415"/>
+            <wp:effectExtent l="0" t="0" r="0" b="635"/>
+            <wp:wrapSquare wrapText="bothSides"/>
+            <wp:docPr id="1" name="Imagen 1"/>
+            <wp:cNvGraphicFramePr>
+              <a:graphicFrameLocks xmlns:a="http://schemas.openxmlformats.org/drawingml/2006/main" noChangeAspect="1"/>
+            </wp:cNvGraphicFramePr>
+            <a:graphic xmlns:a="http://schemas.openxmlformats.org/drawingml/2006/main">
+              <a:graphicData uri="http://schemas.openxmlformats.org/drawingml/2006/picture">
+                <pic:pic xmlns:pic="http://schemas.openxmlformats.org/drawingml/2006/picture">
+                  <pic:nvPicPr>
+                    <pic:cNvPr id="1" name=""/>
+                    <pic:cNvPicPr/>
+                  </pic:nvPicPr>
+                  <pic:blipFill>
+                    <a:blip r:embed="rId13" cstate="print">
+                      <a:extLst>
+                        <a:ext uri="{28A0092B-C50C-407E-A947-70E740481C1C}">
+                          <a14:useLocalDpi xmlns:a14="http://schemas.microsoft.com/office/drawing/2010/main" val="0"/>
+                        </a:ext>
+                      </a:extLst>
+                    </a:blip>
+                    <a:stretch>
+                      <a:fillRect/>
+                    </a:stretch>
+                  </pic:blipFill>
+                  <pic:spPr>
+                    <a:xfrm>
+                      <a:off x="0" y="0"/>
+                      <a:ext cx="1184910" cy="1542415"/>
+                    </a:xfrm>
+                    <a:prstGeom prst="rect">
+                      <a:avLst/>
+                    </a:prstGeom>
+                  </pic:spPr>
+                </pic:pic>
+              </a:graphicData>
+            </a:graphic>
+            <wp14:sizeRelH relativeFrom="margin">
+              <wp14:pctWidth>0</wp14:pctWidth>
+            </wp14:sizeRelH>
+            <wp14:sizeRelV relativeFrom="margin">
+              <wp14:pctHeight>0</wp14:pctHeight>
+            </wp14:sizeRelV>
+          </wp:anchor>
+        </w:drawing>
+      </w:r>
+      <w:r>
+        <w:rPr>
+          <w:b/>
+          <w:color w:val="44546A" w:themeColor="text2"/>
+          <w:sz w:val="40"/>
+        </w:rPr>
+        <w:t xml:space="preserve">PROYECTO INTERMODULAR (DÍA </w:t>
+      </w:r>
+      <w:r>
+        <w:rPr>
+          <w:b/>
+          <w:color w:val="44546A" w:themeColor="text2"/>
+          <w:sz w:val="40"/>
+        </w:rPr>
+        <w:t>2</w:t>
+      </w:r>
+      <w:r>
+        <w:rPr>
+          <w:b/>
+          <w:color w:val="44546A" w:themeColor="text2"/>
+          <w:sz w:val="40"/>
+        </w:rPr>
+        <w:t>)</w:t>
+      </w:r>
+    </w:p>
+    <w:p>
+      <w:pPr>
         <w:spacing w:before="240" w:after="0" w:line="240" w:lineRule="auto"/>
         <w:jc w:val="both"/>
         <w:rPr>
@@ -1087,19 +1186,1827 @@
         <w:rPr>
           <w:b/>
         </w:rPr>
-        <w:t>D</w:t>
-      </w:r>
-      <w:r>
-        <w:rPr>
-          <w:b/>
-        </w:rPr>
-        <w:t>escripción de algún problema del equipo</w:t>
-      </w:r>
-      <w:r>
-        <w:rPr>
-          <w:b/>
-        </w:rPr>
-        <w:t xml:space="preserve"> (DIA 1): </w:t>
+        <w:t>Enlace</w:t>
+      </w:r>
+      <w:r>
+        <w:rPr>
+          <w:b/>
+        </w:rPr>
+        <w:t xml:space="preserve"> </w:t>
+      </w:r>
+      <w:r>
+        <w:rPr>
+          <w:b/>
+        </w:rPr>
+        <w:t>al repositorio principal:</w:t>
+      </w:r>
+      <w:r>
+        <w:t xml:space="preserve"> </w:t>
+      </w:r>
+      <w:hyperlink r:id="rId14" w:history="1">
+        <w:r>
+          <w:rPr>
+            <w:rStyle w:val="Hipervnculo"/>
+          </w:rPr>
+          <w:t>https://github.com/RubenVS44/Plenazo_Intermodular</w:t>
+        </w:r>
+      </w:hyperlink>
+      <w:r>
+        <w:t xml:space="preserve"> </w:t>
+      </w:r>
+    </w:p>
+    <w:p>
+      <w:pPr>
+        <w:spacing w:before="240" w:after="0" w:line="240" w:lineRule="auto"/>
+        <w:jc w:val="both"/>
+        <w:rPr>
+          <w:color w:val="002060"/>
+        </w:rPr>
+      </w:pPr>
+      <w:r>
+        <w:rPr>
+          <w:color w:val="002060"/>
+        </w:rPr>
+        <w:t>Creación de un repositorio común y estructura de las ramas: 1 rama principal, y una rama para cada desarrollador que podrá integrar sus cambios posteriormente mediante un pull request.</w:t>
+      </w:r>
+      <w:r>
+        <w:rPr>
+          <w:noProof/>
+        </w:rPr>
+        <w:t xml:space="preserve"> </w:t>
+      </w:r>
+    </w:p>
+    <w:p>
+      <w:pPr>
+        <w:spacing w:before="240" w:after="0" w:line="240" w:lineRule="auto"/>
+        <w:jc w:val="both"/>
+        <w:rPr>
+          <w:b/>
+          <w:color w:val="002060"/>
+        </w:rPr>
+      </w:pPr>
+      <w:r>
+        <w:rPr>
+          <w:color w:val="002060"/>
+        </w:rPr>
+        <w:t>Añadimos el primer archivo importante -&gt;</w:t>
+      </w:r>
+      <w:r>
+        <w:rPr>
+          <w:b/>
+          <w:color w:val="002060"/>
+        </w:rPr>
+        <w:t xml:space="preserve"> </w:t>
+      </w:r>
+      <w:r>
+        <w:rPr>
+          <w:b/>
+        </w:rPr>
+        <w:t>gitignore</w:t>
+      </w:r>
+    </w:p>
+    <w:p>
+      <w:pPr>
+        <w:spacing w:before="240" w:after="0" w:line="240" w:lineRule="auto"/>
+        <w:jc w:val="both"/>
+        <w:rPr>
+          <w:color w:val="002060"/>
+        </w:rPr>
+      </w:pPr>
+      <w:r>
+        <w:rPr>
+          <w:noProof/>
+          <w:color w:val="002060"/>
+        </w:rPr>
+        <w:drawing>
+          <wp:inline distT="0" distB="0" distL="0" distR="0" wp14:anchorId="797562D6" wp14:editId="275DAB46">
+            <wp:extent cx="4762832" cy="1642684"/>
+            <wp:effectExtent l="0" t="0" r="0" b="0"/>
+            <wp:docPr id="5" name="Imagen 5"/>
+            <wp:cNvGraphicFramePr>
+              <a:graphicFrameLocks xmlns:a="http://schemas.openxmlformats.org/drawingml/2006/main" noChangeAspect="1"/>
+            </wp:cNvGraphicFramePr>
+            <a:graphic xmlns:a="http://schemas.openxmlformats.org/drawingml/2006/main">
+              <a:graphicData uri="http://schemas.openxmlformats.org/drawingml/2006/picture">
+                <pic:pic xmlns:pic="http://schemas.openxmlformats.org/drawingml/2006/picture">
+                  <pic:nvPicPr>
+                    <pic:cNvPr id="1" name=""/>
+                    <pic:cNvPicPr/>
+                  </pic:nvPicPr>
+                  <pic:blipFill>
+                    <a:blip r:embed="rId15"/>
+                    <a:stretch>
+                      <a:fillRect/>
+                    </a:stretch>
+                  </pic:blipFill>
+                  <pic:spPr>
+                    <a:xfrm>
+                      <a:off x="0" y="0"/>
+                      <a:ext cx="4887156" cy="1685563"/>
+                    </a:xfrm>
+                    <a:prstGeom prst="rect">
+                      <a:avLst/>
+                    </a:prstGeom>
+                  </pic:spPr>
+                </pic:pic>
+              </a:graphicData>
+            </a:graphic>
+          </wp:inline>
+        </w:drawing>
+      </w:r>
+    </w:p>
+    <w:p>
+      <w:pPr>
+        <w:rPr>
+          <w:rFonts w:asciiTheme="majorHAnsi" w:eastAsiaTheme="majorEastAsia" w:hAnsiTheme="majorHAnsi" w:cstheme="majorBidi"/>
+          <w:b/>
+          <w:color w:val="002060"/>
+          <w:sz w:val="32"/>
+          <w:szCs w:val="32"/>
+        </w:rPr>
+      </w:pPr>
+      <w:r>
+        <w:rPr>
+          <w:b/>
+          <w:color w:val="002060"/>
+        </w:rPr>
+        <w:br w:type="page"/>
+      </w:r>
+    </w:p>
+    <w:p>
+      <w:pPr>
+        <w:pStyle w:val="Ttulo1"/>
+        <w:spacing w:after="240" w:line="240" w:lineRule="auto"/>
+        <w:jc w:val="both"/>
+        <w:rPr>
+          <w:b/>
+          <w:color w:val="002060"/>
+        </w:rPr>
+      </w:pPr>
+      <w:r>
+        <w:rPr>
+          <w:b/>
+          <w:color w:val="002060"/>
+        </w:rPr>
+        <w:lastRenderedPageBreak/>
+        <w:t>Diagrama Entidad/Relación</w:t>
+      </w:r>
+    </w:p>
+    <w:p>
+      <w:pPr>
+        <w:spacing w:before="240" w:line="240" w:lineRule="auto"/>
+        <w:jc w:val="both"/>
+      </w:pPr>
+      <w:r>
+        <w:rPr>
+          <w:b/>
+        </w:rPr>
+        <w:t xml:space="preserve">Jugadores: </w:t>
+      </w:r>
+      <w:r>
+        <w:rPr>
+          <w:color w:val="002060"/>
+        </w:rPr>
+        <w:t>La tabla jugadores, que almacena la información de cada participante (nombre, correo, teléfono...). Como la liga de la bolera se compite en formato de dos contra dos, cada jugador se asocia a un registro de la tabla parejas mediante la clave foránea id_pareja.</w:t>
+      </w:r>
+    </w:p>
+    <w:p>
+      <w:pPr>
+        <w:spacing w:before="240" w:line="240" w:lineRule="auto"/>
+        <w:jc w:val="both"/>
+        <w:rPr>
+          <w:color w:val="002060"/>
+        </w:rPr>
+      </w:pPr>
+      <w:r>
+        <w:rPr>
+          <w:b/>
+        </w:rPr>
+        <w:t>Competición:</w:t>
+      </w:r>
+      <w:r>
+        <w:t xml:space="preserve"> </w:t>
+      </w:r>
+      <w:r>
+        <w:rPr>
+          <w:color w:val="002060"/>
+        </w:rPr>
+        <w:t>Cuando dos parejas se enfrentan en una jornada del torneo, esa información queda guardada en la tabla partidos. En ella controlamos qué pareja actúa como id_pareja_local y cuál como id_pareja_visitante."</w:t>
+      </w:r>
+    </w:p>
+    <w:p>
+      <w:pPr>
+        <w:spacing w:before="240" w:line="240" w:lineRule="auto"/>
+        <w:jc w:val="both"/>
+        <w:rPr>
+          <w:color w:val="002060"/>
+        </w:rPr>
+      </w:pPr>
+      <w:r>
+        <w:rPr>
+          <w:b/>
+        </w:rPr>
+        <w:t>Resultados:</w:t>
+      </w:r>
+      <w:r>
+        <w:t xml:space="preserve"> </w:t>
+      </w:r>
+      <w:r>
+        <w:rPr>
+          <w:color w:val="002060"/>
+        </w:rPr>
+        <w:t>Para registrar lo que pasa cuando termina el juego, creamos la tabla resultados_clasificacion vinculada directamente al partido. Aquí anotamos los bolos_locales y bolos_visitantes derribados, lo que nos permite calcular de forma automática los puntos para la clasificación de la liga.</w:t>
+      </w:r>
+    </w:p>
+    <w:p>
+      <w:pPr>
+        <w:spacing w:before="240" w:line="240" w:lineRule="auto"/>
+        <w:jc w:val="both"/>
+        <w:rPr>
+          <w:color w:val="002060"/>
+        </w:rPr>
+      </w:pPr>
+      <w:r>
+        <w:rPr>
+          <w:b/>
+        </w:rPr>
+        <w:t>Bolera y horarios:</w:t>
+      </w:r>
+      <w:r>
+        <w:t xml:space="preserve"> </w:t>
+      </w:r>
+      <w:r>
+        <w:rPr>
+          <w:color w:val="002060"/>
+        </w:rPr>
+        <w:t xml:space="preserve">Por último, para que se jueguen los partidos necesitamos la </w:t>
+      </w:r>
+      <w:r>
+        <w:rPr>
+          <w:color w:val="002060"/>
+        </w:rPr>
+        <w:t>bolera, para ello t</w:t>
+      </w:r>
+      <w:r>
+        <w:rPr>
+          <w:color w:val="002060"/>
+        </w:rPr>
+        <w:t xml:space="preserve">enemos la tabla pistas (con el número de </w:t>
+      </w:r>
+      <w:r>
+        <w:rPr>
+          <w:color w:val="002060"/>
+        </w:rPr>
+        <w:t xml:space="preserve">la </w:t>
+      </w:r>
+      <w:r>
+        <w:rPr>
+          <w:color w:val="002060"/>
+        </w:rPr>
+        <w:t xml:space="preserve">pista) y la tabla intermedia reservas_pistas. Esta última es clave porque une una pista, un partido y una fecha/hora concreta (fecha_hora), garantizando que no se puedan </w:t>
+      </w:r>
+      <w:r>
+        <w:rPr>
+          <w:color w:val="002060"/>
+        </w:rPr>
+        <w:t>jugar</w:t>
+      </w:r>
+      <w:r>
+        <w:rPr>
+          <w:color w:val="002060"/>
+        </w:rPr>
+        <w:t xml:space="preserve"> dos partidos en la misma pista al mismo tiempo.</w:t>
+      </w:r>
+    </w:p>
+    <w:p>
+      <w:pPr>
+        <w:spacing w:before="240" w:line="240" w:lineRule="auto"/>
+        <w:jc w:val="both"/>
+        <w:rPr>
+          <w:color w:val="002060"/>
+        </w:rPr>
+      </w:pPr>
+      <w:r>
+        <w:rPr>
+          <w:noProof/>
+        </w:rPr>
+        <w:drawing>
+          <wp:inline distT="0" distB="0" distL="0" distR="0" wp14:anchorId="4F8055E6" wp14:editId="096C3E9C">
+            <wp:extent cx="4260935" cy="3972154"/>
+            <wp:effectExtent l="0" t="0" r="6350" b="9525"/>
+            <wp:docPr id="6" name="Imagen 6"/>
+            <wp:cNvGraphicFramePr>
+              <a:graphicFrameLocks xmlns:a="http://schemas.openxmlformats.org/drawingml/2006/main" noChangeAspect="1"/>
+            </wp:cNvGraphicFramePr>
+            <a:graphic xmlns:a="http://schemas.openxmlformats.org/drawingml/2006/main">
+              <a:graphicData uri="http://schemas.openxmlformats.org/drawingml/2006/picture">
+                <pic:pic xmlns:pic="http://schemas.openxmlformats.org/drawingml/2006/picture">
+                  <pic:nvPicPr>
+                    <pic:cNvPr id="3" name="Entidad-relación.png"/>
+                    <pic:cNvPicPr/>
+                  </pic:nvPicPr>
+                  <pic:blipFill>
+                    <a:blip r:embed="rId16" cstate="print">
+                      <a:extLst>
+                        <a:ext uri="{28A0092B-C50C-407E-A947-70E740481C1C}">
+                          <a14:useLocalDpi xmlns:a14="http://schemas.microsoft.com/office/drawing/2010/main" val="0"/>
+                        </a:ext>
+                      </a:extLst>
+                    </a:blip>
+                    <a:stretch>
+                      <a:fillRect/>
+                    </a:stretch>
+                  </pic:blipFill>
+                  <pic:spPr>
+                    <a:xfrm>
+                      <a:off x="0" y="0"/>
+                      <a:ext cx="4267041" cy="3977846"/>
+                    </a:xfrm>
+                    <a:prstGeom prst="rect">
+                      <a:avLst/>
+                    </a:prstGeom>
+                  </pic:spPr>
+                </pic:pic>
+              </a:graphicData>
+            </a:graphic>
+          </wp:inline>
+        </w:drawing>
+      </w:r>
+    </w:p>
+    <w:p>
+      <w:pPr>
+        <w:spacing w:before="240" w:line="240" w:lineRule="auto"/>
+        <w:jc w:val="both"/>
+        <w:rPr>
+          <w:color w:val="002060"/>
+        </w:rPr>
+      </w:pPr>
+    </w:p>
+    <w:p>
+      <w:pPr>
+        <w:rPr>
+          <w:b/>
+        </w:rPr>
+      </w:pPr>
+      <w:r>
+        <w:rPr>
+          <w:b/>
+        </w:rPr>
+        <w:br w:type="page"/>
+      </w:r>
+    </w:p>
+    <w:p>
+      <w:pPr>
+        <w:pStyle w:val="Ttulo1"/>
+        <w:spacing w:after="240" w:line="240" w:lineRule="auto"/>
+        <w:jc w:val="both"/>
+        <w:rPr>
+          <w:b/>
+          <w:color w:val="44546A" w:themeColor="text2"/>
+          <w:sz w:val="40"/>
+        </w:rPr>
+      </w:pPr>
+      <w:r>
+        <w:rPr>
+          <w:noProof/>
+        </w:rPr>
+        <w:lastRenderedPageBreak/>
+        <w:drawing>
+          <wp:anchor distT="0" distB="0" distL="114300" distR="114300" simplePos="0" relativeHeight="251664384" behindDoc="0" locked="0" layoutInCell="1" allowOverlap="1">
+            <wp:simplePos x="0" y="0"/>
+            <wp:positionH relativeFrom="margin">
+              <wp:posOffset>3922522</wp:posOffset>
+            </wp:positionH>
+            <wp:positionV relativeFrom="margin">
+              <wp:posOffset>-80543</wp:posOffset>
+            </wp:positionV>
+            <wp:extent cx="1367790" cy="716280"/>
+            <wp:effectExtent l="0" t="0" r="0" b="7620"/>
+            <wp:wrapSquare wrapText="bothSides"/>
+            <wp:docPr id="13" name="Imagen 13" descr="What is SQL? - Tech Monitor"/>
+            <wp:cNvGraphicFramePr>
+              <a:graphicFrameLocks xmlns:a="http://schemas.openxmlformats.org/drawingml/2006/main" noChangeAspect="1"/>
+            </wp:cNvGraphicFramePr>
+            <a:graphic xmlns:a="http://schemas.openxmlformats.org/drawingml/2006/main">
+              <a:graphicData uri="http://schemas.openxmlformats.org/drawingml/2006/picture">
+                <pic:pic xmlns:pic="http://schemas.openxmlformats.org/drawingml/2006/picture">
+                  <pic:nvPicPr>
+                    <pic:cNvPr id="0" name="Picture 1" descr="What is SQL? - Tech Monitor"/>
+                    <pic:cNvPicPr>
+                      <a:picLocks noChangeAspect="1" noChangeArrowheads="1"/>
+                    </pic:cNvPicPr>
+                  </pic:nvPicPr>
+                  <pic:blipFill>
+                    <a:blip r:embed="rId17" cstate="print">
+                      <a:extLst>
+                        <a:ext uri="{28A0092B-C50C-407E-A947-70E740481C1C}">
+                          <a14:useLocalDpi xmlns:a14="http://schemas.microsoft.com/office/drawing/2010/main" val="0"/>
+                        </a:ext>
+                      </a:extLst>
+                    </a:blip>
+                    <a:srcRect/>
+                    <a:stretch>
+                      <a:fillRect/>
+                    </a:stretch>
+                  </pic:blipFill>
+                  <pic:spPr bwMode="auto">
+                    <a:xfrm>
+                      <a:off x="0" y="0"/>
+                      <a:ext cx="1367790" cy="716280"/>
+                    </a:xfrm>
+                    <a:prstGeom prst="rect">
+                      <a:avLst/>
+                    </a:prstGeom>
+                    <a:noFill/>
+                    <a:ln>
+                      <a:noFill/>
+                    </a:ln>
+                  </pic:spPr>
+                </pic:pic>
+              </a:graphicData>
+            </a:graphic>
+            <wp14:sizeRelH relativeFrom="margin">
+              <wp14:pctWidth>0</wp14:pctWidth>
+            </wp14:sizeRelH>
+            <wp14:sizeRelV relativeFrom="margin">
+              <wp14:pctHeight>0</wp14:pctHeight>
+            </wp14:sizeRelV>
+          </wp:anchor>
+        </w:drawing>
+      </w:r>
+      <w:r>
+        <w:rPr>
+          <w:b/>
+          <w:color w:val="44546A" w:themeColor="text2"/>
+          <w:sz w:val="40"/>
+        </w:rPr>
+        <w:t>PROYECTO INTERMODULAR (DÍA 3)</w:t>
+      </w:r>
+    </w:p>
+    <w:p>
+      <w:pPr>
+        <w:pStyle w:val="Ttulo1"/>
+        <w:spacing w:after="240" w:line="240" w:lineRule="auto"/>
+        <w:jc w:val="both"/>
+        <w:rPr>
+          <w:b/>
+          <w:color w:val="002060"/>
+          <w:sz w:val="22"/>
+        </w:rPr>
+      </w:pPr>
+      <w:r>
+        <w:rPr>
+          <w:b/>
+          <w:color w:val="002060"/>
+          <w:sz w:val="22"/>
+        </w:rPr>
+        <w:t xml:space="preserve">Implementación del Script SQL </w:t>
+      </w:r>
+    </w:p>
+    <w:p>
+      <w:pPr>
+        <w:spacing w:before="240" w:after="0" w:line="240" w:lineRule="auto"/>
+        <w:jc w:val="both"/>
+        <w:rPr>
+          <w:color w:val="002060"/>
+        </w:rPr>
+      </w:pPr>
+      <w:r>
+        <w:rPr>
+          <w:color w:val="002060"/>
+        </w:rPr>
+        <w:t xml:space="preserve">Una vez validados los diagramas, el equipo </w:t>
+      </w:r>
+      <w:r>
+        <w:rPr>
+          <w:color w:val="002060"/>
+        </w:rPr>
+        <w:t>se encargó</w:t>
+      </w:r>
+      <w:r>
+        <w:rPr>
+          <w:color w:val="002060"/>
+        </w:rPr>
+        <w:t xml:space="preserve"> a trasladar el modelo relacional a código físico para la base de datos y </w:t>
+      </w:r>
+      <w:r>
+        <w:rPr>
+          <w:color w:val="002060"/>
+        </w:rPr>
+        <w:t>empezar a</w:t>
+      </w:r>
+      <w:r>
+        <w:rPr>
+          <w:color w:val="002060"/>
+        </w:rPr>
+        <w:t xml:space="preserve"> crear el proyecto de desarrollo.</w:t>
+      </w:r>
+    </w:p>
+    <w:p>
+      <w:pPr>
+        <w:spacing w:before="240" w:line="240" w:lineRule="auto"/>
+        <w:jc w:val="both"/>
+        <w:rPr>
+          <w:color w:val="002060"/>
+        </w:rPr>
+      </w:pPr>
+      <w:r>
+        <w:rPr>
+          <w:b/>
+        </w:rPr>
+        <w:t>El archivo de la Base de Datos (.sql):</w:t>
+      </w:r>
+      <w:r>
+        <w:t xml:space="preserve"> </w:t>
+      </w:r>
+      <w:r>
+        <w:rPr>
+          <w:color w:val="002060"/>
+        </w:rPr>
+        <w:t>Escribimos el código para crear las tablas en el ordenador (con los comandos CREATE TABLE), asegurándonos de que todo estuviera bien conectado: los jugadores con sus parejas, y los partidos con sus pistas. Además, metimos unos cuantos jugadores y parejas de ejemplo a mano (con comandos INSERT) para tener datos falsos con los que hacer pruebas y ver que todo funcionaba bien desde el principio.</w:t>
+      </w:r>
+    </w:p>
+    <w:p>
+      <w:pPr>
+        <w:spacing w:line="240" w:lineRule="auto"/>
+        <w:jc w:val="both"/>
+        <w:rPr>
+          <w:color w:val="002060"/>
+        </w:rPr>
+      </w:pPr>
+    </w:p>
+    <w:p>
+      <w:pPr>
+        <w:pStyle w:val="Ttulo1"/>
+        <w:spacing w:before="0" w:after="160" w:line="240" w:lineRule="auto"/>
+        <w:jc w:val="both"/>
+        <w:rPr>
+          <w:b/>
+          <w:color w:val="44546A" w:themeColor="text2"/>
+          <w:sz w:val="40"/>
+        </w:rPr>
+      </w:pPr>
+      <w:r>
+        <w:rPr>
+          <w:b/>
+          <w:color w:val="44546A" w:themeColor="text2"/>
+          <w:sz w:val="40"/>
+        </w:rPr>
+        <w:t xml:space="preserve">PROYECTO INTERMODULAR (DÍA </w:t>
+      </w:r>
+      <w:r>
+        <w:rPr>
+          <w:b/>
+          <w:color w:val="44546A" w:themeColor="text2"/>
+          <w:sz w:val="40"/>
+        </w:rPr>
+        <w:t>4</w:t>
+      </w:r>
+      <w:r>
+        <w:rPr>
+          <w:b/>
+          <w:color w:val="44546A" w:themeColor="text2"/>
+          <w:sz w:val="40"/>
+        </w:rPr>
+        <w:t>)</w:t>
+      </w:r>
+    </w:p>
+    <w:p>
+      <w:pPr>
+        <w:pStyle w:val="Ttulo1"/>
+        <w:spacing w:after="240" w:line="240" w:lineRule="auto"/>
+        <w:jc w:val="both"/>
+        <w:rPr>
+          <w:b/>
+          <w:color w:val="002060"/>
+          <w:sz w:val="22"/>
+        </w:rPr>
+      </w:pPr>
+      <w:r>
+        <w:rPr>
+          <w:b/>
+          <w:color w:val="002060"/>
+          <w:sz w:val="22"/>
+        </w:rPr>
+        <w:t>Estructura Inicial en Java</w:t>
+      </w:r>
+    </w:p>
+    <w:p>
+      <w:pPr>
+        <w:spacing w:before="240" w:after="0" w:line="240" w:lineRule="auto"/>
+        <w:jc w:val="both"/>
+        <w:rPr>
+          <w:color w:val="002060"/>
+        </w:rPr>
+      </w:pPr>
+      <w:r>
+        <w:rPr>
+          <w:b/>
+        </w:rPr>
+        <w:t>Los primeros archivos en Java:</w:t>
+      </w:r>
+      <w:r>
+        <w:t xml:space="preserve"> </w:t>
+      </w:r>
+      <w:r>
+        <w:rPr>
+          <w:color w:val="002060"/>
+        </w:rPr>
+        <w:t>En nuestro programa de código, creamos los archivos básicos para empezar a trabajar: Jugador.java, Pareja.java y Pista.java. Estos archivos tienen por dentro las mismas características que pusimos en las tablas de la base de datos (como el nombre del jugador, el teléfono o el número de pista) para que el código y la base de datos hablen el mismo idioma.</w:t>
+      </w:r>
+    </w:p>
+    <w:p>
+      <w:pPr>
+        <w:spacing w:before="240" w:after="0" w:line="240" w:lineRule="auto"/>
+        <w:jc w:val="both"/>
+        <w:rPr>
+          <w:color w:val="002060"/>
+        </w:rPr>
+      </w:pPr>
+      <w:r>
+        <w:rPr>
+          <w:b/>
+        </w:rPr>
+        <w:t>Excepciones</w:t>
+      </w:r>
+      <w:r>
+        <w:rPr>
+          <w:b/>
+        </w:rPr>
+        <w:t xml:space="preserve"> propias</w:t>
+      </w:r>
+      <w:r>
+        <w:rPr>
+          <w:b/>
+        </w:rPr>
+        <w:t>:</w:t>
+      </w:r>
+      <w:r>
+        <w:rPr>
+          <w:b/>
+        </w:rPr>
+        <w:t xml:space="preserve"> </w:t>
+      </w:r>
+      <w:r>
+        <w:rPr>
+          <w:color w:val="002060"/>
+        </w:rPr>
+        <w:t>Creamos unos archivos especiales para controlar los errores, como JugadorDuplicadoException o PistaOcupadaException. Esto sirve para que, si alguien intenta apuntar a un jugador que ya está en la liga o reservar una pista a una hora que ya está pillada, el programa no se rompa ni se cierre, sino que salte un aviso controlado explicando el problema.</w:t>
+      </w:r>
+    </w:p>
+    <w:p>
+      <w:pPr>
+        <w:spacing w:before="240" w:after="0" w:line="240" w:lineRule="auto"/>
+        <w:jc w:val="both"/>
+        <w:rPr>
+          <w:color w:val="002060"/>
+        </w:rPr>
+      </w:pPr>
+      <w:r>
+        <w:rPr>
+          <w:b/>
+        </w:rPr>
+        <w:t>P</w:t>
+      </w:r>
+      <w:r>
+        <w:rPr>
+          <w:b/>
+        </w:rPr>
+        <w:t xml:space="preserve">ruebas (Tests): </w:t>
+      </w:r>
+      <w:r>
+        <w:rPr>
+          <w:color w:val="002060"/>
+        </w:rPr>
+        <w:t xml:space="preserve">Para estar 100% seguros de que el programa de la bolera no tenía fallos ocultos, programamos unos test automáticos. Lo bueno de esto es que el ordenador simula un montón de partidas, registros y puntuaciones de prueba él solo en un segundo. Estuvimos revisando y arreglando el código hasta que todas las pruebas pasaron con </w:t>
+      </w:r>
+      <w:r>
+        <w:rPr>
+          <w:color w:val="002060"/>
+        </w:rPr>
+        <w:t>éxito.</w:t>
+      </w:r>
+    </w:p>
+    <w:p>
+      <w:pPr>
+        <w:spacing w:before="240" w:line="240" w:lineRule="auto"/>
+        <w:jc w:val="both"/>
+        <w:rPr>
+          <w:color w:val="002060"/>
+        </w:rPr>
+      </w:pPr>
+      <w:r>
+        <w:rPr>
+          <w:noProof/>
+          <w:color w:val="002060"/>
+        </w:rPr>
+        <w:drawing>
+          <wp:inline distT="0" distB="0" distL="0" distR="0" wp14:anchorId="4CA06C65" wp14:editId="0036B4C8">
+            <wp:extent cx="5400040" cy="2366645"/>
+            <wp:effectExtent l="0" t="0" r="0" b="0"/>
+            <wp:docPr id="22" name="Imagen 22"/>
+            <wp:cNvGraphicFramePr>
+              <a:graphicFrameLocks xmlns:a="http://schemas.openxmlformats.org/drawingml/2006/main" noChangeAspect="1"/>
+            </wp:cNvGraphicFramePr>
+            <a:graphic xmlns:a="http://schemas.openxmlformats.org/drawingml/2006/main">
+              <a:graphicData uri="http://schemas.openxmlformats.org/drawingml/2006/picture">
+                <pic:pic xmlns:pic="http://schemas.openxmlformats.org/drawingml/2006/picture">
+                  <pic:nvPicPr>
+                    <pic:cNvPr id="1" name=""/>
+                    <pic:cNvPicPr/>
+                  </pic:nvPicPr>
+                  <pic:blipFill>
+                    <a:blip r:embed="rId18"/>
+                    <a:stretch>
+                      <a:fillRect/>
+                    </a:stretch>
+                  </pic:blipFill>
+                  <pic:spPr>
+                    <a:xfrm>
+                      <a:off x="0" y="0"/>
+                      <a:ext cx="5400040" cy="2366645"/>
+                    </a:xfrm>
+                    <a:prstGeom prst="rect">
+                      <a:avLst/>
+                    </a:prstGeom>
+                  </pic:spPr>
+                </pic:pic>
+              </a:graphicData>
+            </a:graphic>
+          </wp:inline>
+        </w:drawing>
+      </w:r>
+    </w:p>
+    <w:p>
+      <w:pPr>
+        <w:rPr>
+          <w:color w:val="002060"/>
+        </w:rPr>
+      </w:pPr>
+      <w:r>
+        <w:rPr>
+          <w:color w:val="002060"/>
+        </w:rPr>
+        <w:br w:type="page"/>
+      </w:r>
+    </w:p>
+    <w:p>
+      <w:pPr>
+        <w:pStyle w:val="Ttulo1"/>
+        <w:spacing w:before="0" w:after="160" w:line="240" w:lineRule="auto"/>
+        <w:jc w:val="both"/>
+        <w:rPr>
+          <w:b/>
+          <w:color w:val="44546A" w:themeColor="text2"/>
+          <w:sz w:val="40"/>
+        </w:rPr>
+      </w:pPr>
+      <w:r>
+        <w:rPr>
+          <w:noProof/>
+        </w:rPr>
+        <w:lastRenderedPageBreak/>
+        <w:drawing>
+          <wp:anchor distT="0" distB="0" distL="114300" distR="114300" simplePos="0" relativeHeight="251665408" behindDoc="0" locked="0" layoutInCell="1" allowOverlap="1">
+            <wp:simplePos x="0" y="0"/>
+            <wp:positionH relativeFrom="margin">
+              <wp:posOffset>3928110</wp:posOffset>
+            </wp:positionH>
+            <wp:positionV relativeFrom="margin">
+              <wp:posOffset>635</wp:posOffset>
+            </wp:positionV>
+            <wp:extent cx="1811020" cy="982345"/>
+            <wp:effectExtent l="0" t="0" r="0" b="8255"/>
+            <wp:wrapSquare wrapText="bothSides"/>
+            <wp:docPr id="26" name="Imagen 26" descr="Qué es una interfaz y para qué sirve | Blog | Hosting Plus España"/>
+            <wp:cNvGraphicFramePr>
+              <a:graphicFrameLocks xmlns:a="http://schemas.openxmlformats.org/drawingml/2006/main" noChangeAspect="1"/>
+            </wp:cNvGraphicFramePr>
+            <a:graphic xmlns:a="http://schemas.openxmlformats.org/drawingml/2006/main">
+              <a:graphicData uri="http://schemas.openxmlformats.org/drawingml/2006/picture">
+                <pic:pic xmlns:pic="http://schemas.openxmlformats.org/drawingml/2006/picture">
+                  <pic:nvPicPr>
+                    <pic:cNvPr id="0" name="Picture 5" descr="Qué es una interfaz y para qué sirve | Blog | Hosting Plus España"/>
+                    <pic:cNvPicPr>
+                      <a:picLocks noChangeAspect="1" noChangeArrowheads="1"/>
+                    </pic:cNvPicPr>
+                  </pic:nvPicPr>
+                  <pic:blipFill>
+                    <a:blip r:embed="rId19" cstate="print">
+                      <a:extLst>
+                        <a:ext uri="{28A0092B-C50C-407E-A947-70E740481C1C}">
+                          <a14:useLocalDpi xmlns:a14="http://schemas.microsoft.com/office/drawing/2010/main" val="0"/>
+                        </a:ext>
+                      </a:extLst>
+                    </a:blip>
+                    <a:srcRect/>
+                    <a:stretch>
+                      <a:fillRect/>
+                    </a:stretch>
+                  </pic:blipFill>
+                  <pic:spPr bwMode="auto">
+                    <a:xfrm>
+                      <a:off x="0" y="0"/>
+                      <a:ext cx="1811020" cy="982345"/>
+                    </a:xfrm>
+                    <a:prstGeom prst="rect">
+                      <a:avLst/>
+                    </a:prstGeom>
+                    <a:noFill/>
+                    <a:ln>
+                      <a:noFill/>
+                    </a:ln>
+                  </pic:spPr>
+                </pic:pic>
+              </a:graphicData>
+            </a:graphic>
+            <wp14:sizeRelH relativeFrom="margin">
+              <wp14:pctWidth>0</wp14:pctWidth>
+            </wp14:sizeRelH>
+            <wp14:sizeRelV relativeFrom="margin">
+              <wp14:pctHeight>0</wp14:pctHeight>
+            </wp14:sizeRelV>
+          </wp:anchor>
+        </w:drawing>
+      </w:r>
+      <w:r>
+        <w:rPr>
+          <w:b/>
+          <w:color w:val="44546A" w:themeColor="text2"/>
+          <w:sz w:val="40"/>
+        </w:rPr>
+        <w:t xml:space="preserve">PROYECTO INTERMODULAR (DÍA </w:t>
+      </w:r>
+      <w:r>
+        <w:rPr>
+          <w:b/>
+          <w:color w:val="44546A" w:themeColor="text2"/>
+          <w:sz w:val="40"/>
+        </w:rPr>
+        <w:t>5</w:t>
+      </w:r>
+      <w:r>
+        <w:rPr>
+          <w:b/>
+          <w:color w:val="44546A" w:themeColor="text2"/>
+          <w:sz w:val="40"/>
+        </w:rPr>
+        <w:t>)</w:t>
+      </w:r>
+      <w:r>
+        <w:t xml:space="preserve"> </w:t>
+      </w:r>
+    </w:p>
+    <w:p>
+      <w:pPr>
+        <w:pStyle w:val="Ttulo1"/>
+        <w:spacing w:after="240" w:line="240" w:lineRule="auto"/>
+        <w:jc w:val="both"/>
+        <w:rPr>
+          <w:b/>
+          <w:color w:val="002060"/>
+          <w:sz w:val="22"/>
+        </w:rPr>
+      </w:pPr>
+      <w:r>
+        <w:rPr>
+          <w:b/>
+          <w:color w:val="002060"/>
+          <w:sz w:val="22"/>
+        </w:rPr>
+        <w:t>Desarrollo de la interfaz gráfica y conexión con los datos</w:t>
+      </w:r>
+    </w:p>
+    <w:p>
+      <w:pPr>
+        <w:pStyle w:val="NormalWeb"/>
+        <w:rPr>
+          <w:rFonts w:asciiTheme="minorHAnsi" w:eastAsiaTheme="minorHAnsi" w:hAnsiTheme="minorHAnsi" w:cstheme="minorBidi"/>
+          <w:color w:val="002060"/>
+          <w:sz w:val="22"/>
+          <w:szCs w:val="22"/>
+          <w:lang w:eastAsia="en-US"/>
+        </w:rPr>
+      </w:pPr>
+      <w:r>
+        <w:rPr>
+          <w:rFonts w:asciiTheme="minorHAnsi" w:eastAsiaTheme="minorHAnsi" w:hAnsiTheme="minorHAnsi" w:cstheme="minorBidi"/>
+          <w:color w:val="002060"/>
+          <w:sz w:val="22"/>
+          <w:szCs w:val="22"/>
+          <w:lang w:eastAsia="en-US"/>
+        </w:rPr>
+        <w:t xml:space="preserve">La interfaz incluye las siguientes secciones del negocio que programamos este día: </w:t>
+      </w:r>
+    </w:p>
+    <w:p>
+      <w:pPr>
+        <w:pStyle w:val="NormalWeb"/>
+        <w:jc w:val="both"/>
+        <w:rPr>
+          <w:rFonts w:asciiTheme="minorHAnsi" w:eastAsiaTheme="minorHAnsi" w:hAnsiTheme="minorHAnsi" w:cstheme="minorBidi"/>
+          <w:color w:val="002060"/>
+          <w:sz w:val="22"/>
+          <w:szCs w:val="22"/>
+          <w:lang w:eastAsia="en-US"/>
+        </w:rPr>
+      </w:pPr>
+      <w:r>
+        <w:rPr>
+          <w:rFonts w:asciiTheme="minorHAnsi" w:eastAsiaTheme="minorHAnsi" w:hAnsiTheme="minorHAnsi" w:cstheme="minorBidi"/>
+          <w:b/>
+          <w:sz w:val="22"/>
+          <w:szCs w:val="22"/>
+          <w:lang w:eastAsia="en-US"/>
+        </w:rPr>
+        <w:t xml:space="preserve">Acceso organizado al panel: </w:t>
+      </w:r>
+      <w:r>
+        <w:rPr>
+          <w:rFonts w:asciiTheme="minorHAnsi" w:eastAsiaTheme="minorHAnsi" w:hAnsiTheme="minorHAnsi" w:cstheme="minorBidi"/>
+          <w:color w:val="002060"/>
+          <w:sz w:val="22"/>
+          <w:szCs w:val="22"/>
+          <w:lang w:eastAsia="en-US"/>
+        </w:rPr>
+        <w:t xml:space="preserve">Un sistema visual con dos bloques. El primero es un formulario para iniciar sesión de forma segura y el segundo es un formulario específico para registrar las parejas que se vayan apuntando a la liga. </w:t>
+      </w:r>
+    </w:p>
+    <w:p>
+      <w:pPr>
+        <w:pStyle w:val="Ttulo3"/>
+        <w:spacing w:after="240" w:line="240" w:lineRule="auto"/>
+        <w:jc w:val="both"/>
+        <w:rPr>
+          <w:rFonts w:asciiTheme="minorHAnsi" w:eastAsiaTheme="minorHAnsi" w:hAnsiTheme="minorHAnsi" w:cstheme="minorBidi"/>
+          <w:color w:val="002060"/>
+          <w:sz w:val="22"/>
+          <w:szCs w:val="22"/>
+        </w:rPr>
+      </w:pPr>
+      <w:r>
+        <w:rPr>
+          <w:rFonts w:asciiTheme="minorHAnsi" w:eastAsiaTheme="minorHAnsi" w:hAnsiTheme="minorHAnsi" w:cstheme="minorBidi"/>
+          <w:b/>
+          <w:color w:val="auto"/>
+          <w:sz w:val="22"/>
+          <w:szCs w:val="22"/>
+        </w:rPr>
+        <w:t>El botón de Cerrar Sesión:</w:t>
+      </w:r>
+      <w:r>
+        <w:rPr>
+          <w:rFonts w:asciiTheme="minorHAnsi" w:eastAsiaTheme="minorHAnsi" w:hAnsiTheme="minorHAnsi" w:cstheme="minorBidi"/>
+          <w:color w:val="auto"/>
+          <w:sz w:val="22"/>
+          <w:szCs w:val="22"/>
+        </w:rPr>
+        <w:t xml:space="preserve"> </w:t>
+      </w:r>
+      <w:r>
+        <w:rPr>
+          <w:rFonts w:asciiTheme="minorHAnsi" w:eastAsiaTheme="minorHAnsi" w:hAnsiTheme="minorHAnsi" w:cstheme="minorBidi"/>
+          <w:color w:val="002060"/>
+          <w:sz w:val="22"/>
+          <w:szCs w:val="22"/>
+        </w:rPr>
+        <w:t>Añadimos un sistema de cierre de sesión interactivo. Al hacer clic, se activa un script que resetea la interfaz por completo; esconde los marcadores, informes y reservas, y regresa automáticamente al formulario de acceso origina</w:t>
+      </w:r>
+      <w:r>
+        <w:rPr>
+          <w:rFonts w:asciiTheme="minorHAnsi" w:eastAsiaTheme="minorHAnsi" w:hAnsiTheme="minorHAnsi" w:cstheme="minorBidi"/>
+          <w:color w:val="002060"/>
+          <w:sz w:val="22"/>
+          <w:szCs w:val="22"/>
+        </w:rPr>
+        <w:t>l.</w:t>
+      </w:r>
+    </w:p>
+    <w:p>
+      <w:pPr>
+        <w:pStyle w:val="Ttulo3"/>
+        <w:spacing w:after="240" w:line="240" w:lineRule="auto"/>
+        <w:jc w:val="both"/>
+        <w:rPr>
+          <w:rFonts w:asciiTheme="minorHAnsi" w:eastAsiaTheme="minorHAnsi" w:hAnsiTheme="minorHAnsi" w:cstheme="minorBidi"/>
+          <w:color w:val="002060"/>
+          <w:sz w:val="22"/>
+          <w:szCs w:val="22"/>
+        </w:rPr>
+      </w:pPr>
+      <w:r>
+        <w:rPr>
+          <w:rFonts w:asciiTheme="minorHAnsi" w:eastAsiaTheme="minorHAnsi" w:hAnsiTheme="minorHAnsi" w:cstheme="minorBidi"/>
+          <w:b/>
+          <w:color w:val="auto"/>
+          <w:sz w:val="22"/>
+          <w:szCs w:val="22"/>
+        </w:rPr>
+        <w:t>El contador dinámico de partidos</w:t>
+      </w:r>
+      <w:r>
+        <w:rPr>
+          <w:rFonts w:asciiTheme="minorHAnsi" w:eastAsiaTheme="minorHAnsi" w:hAnsiTheme="minorHAnsi" w:cstheme="minorBidi"/>
+          <w:color w:val="002060"/>
+          <w:sz w:val="22"/>
+          <w:szCs w:val="22"/>
+        </w:rPr>
+        <w:t xml:space="preserve">: Un marcador inteligente en la parte de arriba de la web que suma un número de forma automática cada vez que rellenamos el formulario e insertamos una nueva reserva de pista con éxito.  </w:t>
+      </w:r>
+    </w:p>
+    <w:p>
+      <w:pPr>
+        <w:pStyle w:val="Ttulo3"/>
+        <w:spacing w:after="240" w:line="240" w:lineRule="auto"/>
+        <w:jc w:val="both"/>
+        <w:rPr>
+          <w:rFonts w:asciiTheme="minorHAnsi" w:eastAsiaTheme="minorHAnsi" w:hAnsiTheme="minorHAnsi" w:cstheme="minorBidi"/>
+          <w:color w:val="002060"/>
+          <w:sz w:val="22"/>
+          <w:szCs w:val="22"/>
+        </w:rPr>
+      </w:pPr>
+      <w:r>
+        <w:rPr>
+          <w:rFonts w:asciiTheme="minorHAnsi" w:eastAsiaTheme="minorHAnsi" w:hAnsiTheme="minorHAnsi" w:cstheme="minorBidi"/>
+          <w:b/>
+          <w:color w:val="auto"/>
+          <w:sz w:val="22"/>
+          <w:szCs w:val="22"/>
+        </w:rPr>
+        <w:t>El consultor de sensores físicos:</w:t>
+      </w:r>
+      <w:r>
+        <w:rPr>
+          <w:rFonts w:asciiTheme="minorHAnsi" w:eastAsiaTheme="minorHAnsi" w:hAnsiTheme="minorHAnsi" w:cstheme="minorBidi"/>
+          <w:color w:val="auto"/>
+          <w:sz w:val="22"/>
+          <w:szCs w:val="22"/>
+        </w:rPr>
+        <w:t xml:space="preserve"> </w:t>
+      </w:r>
+      <w:r>
+        <w:rPr>
+          <w:rFonts w:asciiTheme="minorHAnsi" w:eastAsiaTheme="minorHAnsi" w:hAnsiTheme="minorHAnsi" w:cstheme="minorBidi"/>
+          <w:color w:val="002060"/>
+          <w:sz w:val="22"/>
+          <w:szCs w:val="22"/>
+        </w:rPr>
+        <w:t xml:space="preserve">Un menú desplegable que simula la conexión con las pistas de la bolera en tiempo real. Al elegir una pista y darle al botón de consultar, salta una alerta en la pantalla avisándote si el canal de datos está libre, </w:t>
+      </w:r>
+      <w:r>
+        <w:rPr>
+          <w:rFonts w:asciiTheme="minorHAnsi" w:eastAsiaTheme="minorHAnsi" w:hAnsiTheme="minorHAnsi" w:cstheme="minorBidi"/>
+          <w:color w:val="002060"/>
+          <w:sz w:val="22"/>
+          <w:szCs w:val="22"/>
+        </w:rPr>
+        <w:t>o en mantenimiento</w:t>
+      </w:r>
+      <w:r>
+        <w:rPr>
+          <w:rFonts w:asciiTheme="minorHAnsi" w:eastAsiaTheme="minorHAnsi" w:hAnsiTheme="minorHAnsi" w:cstheme="minorBidi"/>
+          <w:color w:val="002060"/>
+          <w:sz w:val="22"/>
+          <w:szCs w:val="22"/>
+        </w:rPr>
+        <w:t xml:space="preserve">. </w:t>
+      </w:r>
+    </w:p>
+    <w:p>
+      <w:pPr>
+        <w:pStyle w:val="NormalWeb"/>
+        <w:jc w:val="both"/>
+        <w:rPr>
+          <w:rFonts w:asciiTheme="minorHAnsi" w:eastAsiaTheme="minorHAnsi" w:hAnsiTheme="minorHAnsi" w:cstheme="minorBidi"/>
+          <w:color w:val="002060"/>
+          <w:sz w:val="22"/>
+          <w:szCs w:val="22"/>
+          <w:lang w:eastAsia="en-US"/>
+        </w:rPr>
+      </w:pPr>
+      <w:r>
+        <w:rPr>
+          <w:rFonts w:asciiTheme="minorHAnsi" w:eastAsiaTheme="minorHAnsi" w:hAnsiTheme="minorHAnsi" w:cstheme="minorBidi"/>
+          <w:b/>
+          <w:sz w:val="22"/>
+          <w:szCs w:val="22"/>
+          <w:lang w:eastAsia="en-US"/>
+        </w:rPr>
+        <w:t>Informe (Jornada 6):</w:t>
+      </w:r>
+      <w:r>
+        <w:rPr>
+          <w:rFonts w:asciiTheme="minorHAnsi" w:eastAsiaTheme="minorHAnsi" w:hAnsiTheme="minorHAnsi" w:cstheme="minorBidi"/>
+          <w:sz w:val="22"/>
+          <w:szCs w:val="22"/>
+          <w:lang w:eastAsia="en-US"/>
+        </w:rPr>
+        <w:t xml:space="preserve"> </w:t>
+      </w:r>
+      <w:r>
+        <w:rPr>
+          <w:rFonts w:asciiTheme="minorHAnsi" w:eastAsiaTheme="minorHAnsi" w:hAnsiTheme="minorHAnsi" w:cstheme="minorBidi"/>
+          <w:color w:val="002060"/>
+          <w:sz w:val="22"/>
+          <w:szCs w:val="22"/>
+          <w:lang w:eastAsia="en-US"/>
+        </w:rPr>
+        <w:t xml:space="preserve">Un apartado que resume las estadísticas importantes del torneo de un vistazo, como la cantidad de partidos jugados, los plenos totales, y un pequeño resumen de cómo va la </w:t>
+      </w:r>
+      <w:r>
+        <w:rPr>
+          <w:rFonts w:asciiTheme="minorHAnsi" w:eastAsiaTheme="minorHAnsi" w:hAnsiTheme="minorHAnsi" w:cstheme="minorBidi"/>
+          <w:color w:val="002060"/>
+          <w:sz w:val="22"/>
+          <w:szCs w:val="22"/>
+          <w:lang w:eastAsia="en-US"/>
+        </w:rPr>
+        <w:t>jornada</w:t>
+      </w:r>
+      <w:r>
+        <w:rPr>
+          <w:rFonts w:asciiTheme="minorHAnsi" w:eastAsiaTheme="minorHAnsi" w:hAnsiTheme="minorHAnsi" w:cstheme="minorBidi"/>
+          <w:color w:val="002060"/>
+          <w:sz w:val="22"/>
+          <w:szCs w:val="22"/>
+          <w:lang w:eastAsia="en-US"/>
+        </w:rPr>
+        <w:t xml:space="preserve">. </w:t>
+      </w:r>
+    </w:p>
+    <w:p>
+      <w:pPr>
+        <w:pStyle w:val="NormalWeb"/>
+        <w:jc w:val="both"/>
+        <w:rPr>
+          <w:rFonts w:asciiTheme="minorHAnsi" w:eastAsiaTheme="minorHAnsi" w:hAnsiTheme="minorHAnsi" w:cstheme="minorBidi"/>
+          <w:color w:val="002060"/>
+          <w:sz w:val="22"/>
+          <w:szCs w:val="22"/>
+          <w:lang w:eastAsia="en-US"/>
+        </w:rPr>
+      </w:pPr>
+      <w:r>
+        <w:rPr>
+          <w:rFonts w:asciiTheme="minorHAnsi" w:eastAsiaTheme="minorHAnsi" w:hAnsiTheme="minorHAnsi" w:cstheme="minorBidi"/>
+          <w:b/>
+          <w:sz w:val="22"/>
+          <w:szCs w:val="22"/>
+          <w:lang w:eastAsia="en-US"/>
+        </w:rPr>
+        <w:t xml:space="preserve">Marcadores </w:t>
+      </w:r>
+      <w:r>
+        <w:rPr>
+          <w:rFonts w:asciiTheme="minorHAnsi" w:eastAsiaTheme="minorHAnsi" w:hAnsiTheme="minorHAnsi" w:cstheme="minorBidi"/>
+          <w:b/>
+          <w:sz w:val="22"/>
+          <w:szCs w:val="22"/>
+          <w:lang w:eastAsia="en-US"/>
+        </w:rPr>
+        <w:t>r</w:t>
+      </w:r>
+      <w:r>
+        <w:rPr>
+          <w:rFonts w:asciiTheme="minorHAnsi" w:eastAsiaTheme="minorHAnsi" w:hAnsiTheme="minorHAnsi" w:cstheme="minorBidi"/>
+          <w:b/>
+          <w:sz w:val="22"/>
+          <w:szCs w:val="22"/>
+          <w:lang w:eastAsia="en-US"/>
+        </w:rPr>
+        <w:t xml:space="preserve">ecientes y </w:t>
+      </w:r>
+      <w:r>
+        <w:rPr>
+          <w:rFonts w:asciiTheme="minorHAnsi" w:eastAsiaTheme="minorHAnsi" w:hAnsiTheme="minorHAnsi" w:cstheme="minorBidi"/>
+          <w:b/>
+          <w:sz w:val="22"/>
+          <w:szCs w:val="22"/>
+          <w:lang w:eastAsia="en-US"/>
+        </w:rPr>
+        <w:t>c</w:t>
+      </w:r>
+      <w:r>
+        <w:rPr>
+          <w:rFonts w:asciiTheme="minorHAnsi" w:eastAsiaTheme="minorHAnsi" w:hAnsiTheme="minorHAnsi" w:cstheme="minorBidi"/>
+          <w:b/>
+          <w:sz w:val="22"/>
+          <w:szCs w:val="22"/>
+          <w:lang w:eastAsia="en-US"/>
+        </w:rPr>
+        <w:t>lasificación:</w:t>
+      </w:r>
+      <w:r>
+        <w:rPr>
+          <w:rFonts w:asciiTheme="minorHAnsi" w:eastAsiaTheme="minorHAnsi" w:hAnsiTheme="minorHAnsi" w:cstheme="minorBidi"/>
+          <w:sz w:val="22"/>
+          <w:szCs w:val="22"/>
+          <w:lang w:eastAsia="en-US"/>
+        </w:rPr>
+        <w:t xml:space="preserve"> </w:t>
+      </w:r>
+      <w:r>
+        <w:rPr>
+          <w:rFonts w:asciiTheme="minorHAnsi" w:eastAsiaTheme="minorHAnsi" w:hAnsiTheme="minorHAnsi" w:cstheme="minorBidi"/>
+          <w:color w:val="002060"/>
+          <w:sz w:val="22"/>
+          <w:szCs w:val="22"/>
+          <w:lang w:eastAsia="en-US"/>
+        </w:rPr>
+        <w:t xml:space="preserve">Una tabla dinámica que muestra en tiempo real las 10 parejas oficiales de la liga (como Strike Masters, Los Plenos o Los Turbos) ordenadas por sus puntos conseguidos. Al lado, pusimos un cuadro con los últimos resultados de los partidos jugados. </w:t>
+      </w:r>
+    </w:p>
+    <w:p>
+      <w:pPr>
+        <w:pStyle w:val="NormalWeb"/>
+        <w:jc w:val="both"/>
+        <w:rPr>
+          <w:noProof/>
+          <w:color w:val="002060"/>
+        </w:rPr>
+      </w:pPr>
+      <w:r>
+        <w:rPr>
+          <w:noProof/>
+          <w:color w:val="002060"/>
+        </w:rPr>
+        <w:drawing>
+          <wp:anchor distT="0" distB="0" distL="114300" distR="114300" simplePos="0" relativeHeight="251667456" behindDoc="0" locked="0" layoutInCell="1" allowOverlap="1" wp14:anchorId="1BEE393F">
+            <wp:simplePos x="0" y="0"/>
+            <wp:positionH relativeFrom="margin">
+              <wp:posOffset>3814445</wp:posOffset>
+            </wp:positionH>
+            <wp:positionV relativeFrom="margin">
+              <wp:posOffset>6565265</wp:posOffset>
+            </wp:positionV>
+            <wp:extent cx="2433320" cy="1389380"/>
+            <wp:effectExtent l="0" t="0" r="5080" b="1270"/>
+            <wp:wrapSquare wrapText="bothSides"/>
+            <wp:docPr id="8" name="Imagen 8"/>
+            <wp:cNvGraphicFramePr>
+              <a:graphicFrameLocks xmlns:a="http://schemas.openxmlformats.org/drawingml/2006/main" noChangeAspect="1"/>
+            </wp:cNvGraphicFramePr>
+            <a:graphic xmlns:a="http://schemas.openxmlformats.org/drawingml/2006/main">
+              <a:graphicData uri="http://schemas.openxmlformats.org/drawingml/2006/picture">
+                <pic:pic xmlns:pic="http://schemas.openxmlformats.org/drawingml/2006/picture">
+                  <pic:nvPicPr>
+                    <pic:cNvPr id="1" name=""/>
+                    <pic:cNvPicPr/>
+                  </pic:nvPicPr>
+                  <pic:blipFill>
+                    <a:blip r:embed="rId20" cstate="print">
+                      <a:extLst>
+                        <a:ext uri="{28A0092B-C50C-407E-A947-70E740481C1C}">
+                          <a14:useLocalDpi xmlns:a14="http://schemas.microsoft.com/office/drawing/2010/main" val="0"/>
+                        </a:ext>
+                      </a:extLst>
+                    </a:blip>
+                    <a:stretch>
+                      <a:fillRect/>
+                    </a:stretch>
+                  </pic:blipFill>
+                  <pic:spPr>
+                    <a:xfrm>
+                      <a:off x="0" y="0"/>
+                      <a:ext cx="2433320" cy="1389380"/>
+                    </a:xfrm>
+                    <a:prstGeom prst="rect">
+                      <a:avLst/>
+                    </a:prstGeom>
+                  </pic:spPr>
+                </pic:pic>
+              </a:graphicData>
+            </a:graphic>
+            <wp14:sizeRelH relativeFrom="margin">
+              <wp14:pctWidth>0</wp14:pctWidth>
+            </wp14:sizeRelH>
+            <wp14:sizeRelV relativeFrom="margin">
+              <wp14:pctHeight>0</wp14:pctHeight>
+            </wp14:sizeRelV>
+          </wp:anchor>
+        </w:drawing>
+      </w:r>
+      <w:r>
+        <w:rPr>
+          <w:noProof/>
+          <w:color w:val="002060"/>
+        </w:rPr>
+        <w:drawing>
+          <wp:anchor distT="0" distB="0" distL="114300" distR="114300" simplePos="0" relativeHeight="251668480" behindDoc="0" locked="0" layoutInCell="1" allowOverlap="1" wp14:anchorId="67AB5405">
+            <wp:simplePos x="0" y="0"/>
+            <wp:positionH relativeFrom="margin">
+              <wp:align>left</wp:align>
+            </wp:positionH>
+            <wp:positionV relativeFrom="margin">
+              <wp:posOffset>6534218</wp:posOffset>
+            </wp:positionV>
+            <wp:extent cx="3711575" cy="1492250"/>
+            <wp:effectExtent l="0" t="0" r="3175" b="0"/>
+            <wp:wrapSquare wrapText="bothSides"/>
+            <wp:docPr id="12" name="Imagen 12"/>
+            <wp:cNvGraphicFramePr>
+              <a:graphicFrameLocks xmlns:a="http://schemas.openxmlformats.org/drawingml/2006/main" noChangeAspect="1"/>
+            </wp:cNvGraphicFramePr>
+            <a:graphic xmlns:a="http://schemas.openxmlformats.org/drawingml/2006/main">
+              <a:graphicData uri="http://schemas.openxmlformats.org/drawingml/2006/picture">
+                <pic:pic xmlns:pic="http://schemas.openxmlformats.org/drawingml/2006/picture">
+                  <pic:nvPicPr>
+                    <pic:cNvPr id="1" name=""/>
+                    <pic:cNvPicPr/>
+                  </pic:nvPicPr>
+                  <pic:blipFill>
+                    <a:blip r:embed="rId21" cstate="print">
+                      <a:extLst>
+                        <a:ext uri="{28A0092B-C50C-407E-A947-70E740481C1C}">
+                          <a14:useLocalDpi xmlns:a14="http://schemas.microsoft.com/office/drawing/2010/main" val="0"/>
+                        </a:ext>
+                      </a:extLst>
+                    </a:blip>
+                    <a:stretch>
+                      <a:fillRect/>
+                    </a:stretch>
+                  </pic:blipFill>
+                  <pic:spPr>
+                    <a:xfrm>
+                      <a:off x="0" y="0"/>
+                      <a:ext cx="3711575" cy="1492250"/>
+                    </a:xfrm>
+                    <a:prstGeom prst="rect">
+                      <a:avLst/>
+                    </a:prstGeom>
+                  </pic:spPr>
+                </pic:pic>
+              </a:graphicData>
+            </a:graphic>
+            <wp14:sizeRelH relativeFrom="margin">
+              <wp14:pctWidth>0</wp14:pctWidth>
+            </wp14:sizeRelH>
+            <wp14:sizeRelV relativeFrom="margin">
+              <wp14:pctHeight>0</wp14:pctHeight>
+            </wp14:sizeRelV>
+          </wp:anchor>
+        </w:drawing>
+      </w:r>
+      <w:r>
+        <w:rPr>
+          <w:rFonts w:asciiTheme="minorHAnsi" w:eastAsiaTheme="minorHAnsi" w:hAnsiTheme="minorHAnsi" w:cstheme="minorBidi"/>
+          <w:b/>
+          <w:sz w:val="22"/>
+          <w:szCs w:val="22"/>
+          <w:lang w:eastAsia="en-US"/>
+        </w:rPr>
+        <w:t>Reserva de pistas y alertas automatizadas:</w:t>
+      </w:r>
+      <w:r>
+        <w:rPr>
+          <w:rFonts w:asciiTheme="minorHAnsi" w:eastAsiaTheme="minorHAnsi" w:hAnsiTheme="minorHAnsi" w:cstheme="minorBidi"/>
+          <w:sz w:val="22"/>
+          <w:szCs w:val="22"/>
+          <w:lang w:eastAsia="en-US"/>
+        </w:rPr>
+        <w:t xml:space="preserve"> </w:t>
+      </w:r>
+      <w:r>
+        <w:rPr>
+          <w:rFonts w:asciiTheme="minorHAnsi" w:eastAsiaTheme="minorHAnsi" w:hAnsiTheme="minorHAnsi" w:cstheme="minorBidi"/>
+          <w:color w:val="002060"/>
+          <w:sz w:val="22"/>
+          <w:szCs w:val="22"/>
+          <w:lang w:eastAsia="en-US"/>
+        </w:rPr>
+        <w:t>Un formulario interactivo para pedir pista introduciendo el equipo, el día y la hora. Además, añadimos una zona de alertas con luces de colores (rojo, amarillo y verde) que se conecta con los sensores para avisar al usuario si una pista está libre, en mantenimiento por avería mecánica o si ya está asignada a la competición oficial para evitar que se dupliquen las reservas.</w:t>
+      </w:r>
+      <w:r>
+        <w:rPr>
+          <w:noProof/>
+          <w:color w:val="002060"/>
+        </w:rPr>
+        <w:t xml:space="preserve"> </w:t>
+      </w:r>
+    </w:p>
+    <w:p>
+      <w:pPr>
+        <w:pStyle w:val="NormalWeb"/>
+        <w:jc w:val="both"/>
+        <w:rPr>
+          <w:noProof/>
+          <w:color w:val="002060"/>
+        </w:rPr>
+      </w:pPr>
+    </w:p>
+    <w:p>
+      <w:pPr>
+        <w:pStyle w:val="NormalWeb"/>
+        <w:jc w:val="both"/>
+        <w:rPr>
+          <w:rFonts w:asciiTheme="minorHAnsi" w:eastAsiaTheme="minorHAnsi" w:hAnsiTheme="minorHAnsi" w:cstheme="minorBidi"/>
+          <w:color w:val="002060"/>
+          <w:sz w:val="22"/>
+          <w:szCs w:val="22"/>
+          <w:lang w:eastAsia="en-US"/>
+        </w:rPr>
+      </w:pPr>
+    </w:p>
+    <w:p>
+      <w:pPr>
+        <w:pStyle w:val="Ttulo1"/>
+        <w:spacing w:before="0" w:after="160" w:line="240" w:lineRule="auto"/>
+        <w:jc w:val="both"/>
+      </w:pPr>
+      <w:bookmarkStart w:id="0" w:name="_Hlk231900361"/>
+      <w:r>
+        <w:rPr>
+          <w:noProof/>
+        </w:rPr>
+        <w:lastRenderedPageBreak/>
+        <w:drawing>
+          <wp:anchor distT="0" distB="0" distL="114300" distR="114300" simplePos="0" relativeHeight="251666432" behindDoc="0" locked="0" layoutInCell="1" allowOverlap="1" wp14:anchorId="7C24D914">
+            <wp:simplePos x="0" y="0"/>
+            <wp:positionH relativeFrom="margin">
+              <wp:posOffset>4348480</wp:posOffset>
+            </wp:positionH>
+            <wp:positionV relativeFrom="margin">
+              <wp:posOffset>-86995</wp:posOffset>
+            </wp:positionV>
+            <wp:extent cx="1149985" cy="767080"/>
+            <wp:effectExtent l="0" t="0" r="0" b="0"/>
+            <wp:wrapSquare wrapText="bothSides"/>
+            <wp:docPr id="29" name="Imagen 29"/>
+            <wp:cNvGraphicFramePr>
+              <a:graphicFrameLocks xmlns:a="http://schemas.openxmlformats.org/drawingml/2006/main" noChangeAspect="1"/>
+            </wp:cNvGraphicFramePr>
+            <a:graphic xmlns:a="http://schemas.openxmlformats.org/drawingml/2006/main">
+              <a:graphicData uri="http://schemas.openxmlformats.org/drawingml/2006/picture">
+                <pic:pic xmlns:pic="http://schemas.openxmlformats.org/drawingml/2006/picture">
+                  <pic:nvPicPr>
+                    <pic:cNvPr id="0" name="Picture 2"/>
+                    <pic:cNvPicPr>
+                      <a:picLocks noChangeAspect="1" noChangeArrowheads="1"/>
+                    </pic:cNvPicPr>
+                  </pic:nvPicPr>
+                  <pic:blipFill>
+                    <a:blip r:embed="rId22" cstate="print">
+                      <a:extLst>
+                        <a:ext uri="{28A0092B-C50C-407E-A947-70E740481C1C}">
+                          <a14:useLocalDpi xmlns:a14="http://schemas.microsoft.com/office/drawing/2010/main" val="0"/>
+                        </a:ext>
+                      </a:extLst>
+                    </a:blip>
+                    <a:srcRect/>
+                    <a:stretch>
+                      <a:fillRect/>
+                    </a:stretch>
+                  </pic:blipFill>
+                  <pic:spPr bwMode="auto">
+                    <a:xfrm>
+                      <a:off x="0" y="0"/>
+                      <a:ext cx="1149985" cy="767080"/>
+                    </a:xfrm>
+                    <a:prstGeom prst="rect">
+                      <a:avLst/>
+                    </a:prstGeom>
+                    <a:noFill/>
+                  </pic:spPr>
+                </pic:pic>
+              </a:graphicData>
+            </a:graphic>
+            <wp14:sizeRelH relativeFrom="margin">
+              <wp14:pctWidth>0</wp14:pctWidth>
+            </wp14:sizeRelH>
+            <wp14:sizeRelV relativeFrom="margin">
+              <wp14:pctHeight>0</wp14:pctHeight>
+            </wp14:sizeRelV>
+          </wp:anchor>
+        </w:drawing>
+      </w:r>
+      <w:r>
+        <w:rPr>
+          <w:b/>
+          <w:color w:val="44546A" w:themeColor="text2"/>
+          <w:sz w:val="40"/>
+        </w:rPr>
+        <w:t xml:space="preserve">PROYECTO INTERMODULAR (DÍA </w:t>
+      </w:r>
+      <w:r>
+        <w:rPr>
+          <w:b/>
+          <w:color w:val="44546A" w:themeColor="text2"/>
+          <w:sz w:val="40"/>
+        </w:rPr>
+        <w:t>6</w:t>
+      </w:r>
+      <w:r>
+        <w:rPr>
+          <w:b/>
+          <w:color w:val="44546A" w:themeColor="text2"/>
+          <w:sz w:val="40"/>
+        </w:rPr>
+        <w:t>)</w:t>
+      </w:r>
+      <w:r>
+        <w:t xml:space="preserve"> </w:t>
+      </w:r>
+    </w:p>
+    <w:p>
+      <w:pPr>
+        <w:pStyle w:val="Ttulo1"/>
+        <w:spacing w:after="240" w:line="240" w:lineRule="auto"/>
+        <w:jc w:val="both"/>
+        <w:rPr>
+          <w:b/>
+          <w:color w:val="002060"/>
+          <w:sz w:val="22"/>
+        </w:rPr>
+      </w:pPr>
+      <w:r>
+        <w:rPr>
+          <w:b/>
+          <w:color w:val="002060"/>
+          <w:sz w:val="22"/>
+        </w:rPr>
+        <w:t>El historial de acciones (Log), los últimos retoques y la mudanza a AWS</w:t>
+      </w:r>
+    </w:p>
+    <w:p>
+      <w:pPr>
+        <w:pStyle w:val="Ttulo3"/>
+        <w:spacing w:after="240" w:line="240" w:lineRule="auto"/>
+        <w:jc w:val="both"/>
+        <w:rPr>
+          <w:rFonts w:asciiTheme="minorHAnsi" w:eastAsiaTheme="minorHAnsi" w:hAnsiTheme="minorHAnsi" w:cstheme="minorBidi"/>
+          <w:color w:val="002060"/>
+          <w:sz w:val="22"/>
+          <w:szCs w:val="22"/>
+        </w:rPr>
+      </w:pPr>
+      <w:r>
+        <w:rPr>
+          <w:rFonts w:asciiTheme="minorHAnsi" w:eastAsiaTheme="minorHAnsi" w:hAnsiTheme="minorHAnsi" w:cstheme="minorBidi"/>
+          <w:color w:val="002060"/>
+          <w:sz w:val="22"/>
+          <w:szCs w:val="22"/>
+        </w:rPr>
+        <w:t>Este día nos centramos en crear un sistema de vigilancia oculto para el programa</w:t>
+      </w:r>
+      <w:r>
+        <w:rPr>
+          <w:rFonts w:asciiTheme="minorHAnsi" w:eastAsiaTheme="minorHAnsi" w:hAnsiTheme="minorHAnsi" w:cstheme="minorBidi"/>
+          <w:color w:val="002060"/>
+          <w:sz w:val="22"/>
+          <w:szCs w:val="22"/>
+        </w:rPr>
+        <w:t xml:space="preserve"> </w:t>
+      </w:r>
+      <w:r>
+        <w:rPr>
+          <w:rFonts w:asciiTheme="minorHAnsi" w:eastAsiaTheme="minorHAnsi" w:hAnsiTheme="minorHAnsi" w:cstheme="minorBidi"/>
+          <w:color w:val="002060"/>
+          <w:sz w:val="22"/>
+          <w:szCs w:val="22"/>
+        </w:rPr>
+        <w:t xml:space="preserve">y dar el primer gran paso para subir la aplicación a internet.  </w:t>
+      </w:r>
+    </w:p>
+    <w:p>
+      <w:pPr>
+        <w:spacing w:before="100" w:beforeAutospacing="1" w:after="0" w:line="240" w:lineRule="auto"/>
+        <w:jc w:val="both"/>
+        <w:rPr>
+          <w:color w:val="002060"/>
+        </w:rPr>
+      </w:pPr>
+      <w:r>
+        <w:rPr>
+          <w:b/>
+        </w:rPr>
+        <w:t xml:space="preserve">El Fichero de Log (logback.xml): </w:t>
+      </w:r>
+      <w:r>
+        <w:rPr>
+          <w:color w:val="002060"/>
+        </w:rPr>
+        <w:t xml:space="preserve">Creamos un archivo especial en Java llamado </w:t>
+      </w:r>
+      <w:r>
+        <w:rPr>
+          <w:color w:val="002060"/>
+        </w:rPr>
+        <w:t>“</w:t>
+      </w:r>
+      <w:r>
+        <w:rPr>
+          <w:color w:val="002060"/>
+        </w:rPr>
+        <w:t>logback.xml</w:t>
+      </w:r>
+      <w:r>
+        <w:rPr>
+          <w:color w:val="002060"/>
+        </w:rPr>
+        <w:t xml:space="preserve">” </w:t>
+      </w:r>
+      <w:r>
+        <w:rPr>
+          <w:color w:val="002060"/>
+        </w:rPr>
+        <w:t>dentro de la carpeta de recursos del programa. Su función es organizar los avisos y errores que van saliendo en la pantalla negra de la consola. Nos muestra de forma ordenada la hora exacta, qué tipo de aviso es y el mensaje del problema. Además, lo programamos para que vigile muy de cerca nuestras tablas (entidades) y la conexión con la base de datos (Hibernate), así sabemos al instante si surge cualquier fallo o error inesperado por dentro.</w:t>
+      </w:r>
+    </w:p>
+    <w:p>
+      <w:pPr>
+        <w:spacing w:before="100" w:beforeAutospacing="1" w:after="0" w:line="240" w:lineRule="auto"/>
+        <w:jc w:val="both"/>
+        <w:rPr>
+          <w:b/>
+        </w:rPr>
+      </w:pPr>
+      <w:r>
+        <w:rPr>
+          <w:b/>
+        </w:rPr>
+        <w:drawing>
+          <wp:inline distT="0" distB="0" distL="0" distR="0" wp14:anchorId="5A8E2025" wp14:editId="697CA847">
+            <wp:extent cx="4593265" cy="1851565"/>
+            <wp:effectExtent l="0" t="0" r="0" b="0"/>
+            <wp:docPr id="14" name="Imagen 14"/>
+            <wp:cNvGraphicFramePr>
+              <a:graphicFrameLocks xmlns:a="http://schemas.openxmlformats.org/drawingml/2006/main" noChangeAspect="1"/>
+            </wp:cNvGraphicFramePr>
+            <a:graphic xmlns:a="http://schemas.openxmlformats.org/drawingml/2006/main">
+              <a:graphicData uri="http://schemas.openxmlformats.org/drawingml/2006/picture">
+                <pic:pic xmlns:pic="http://schemas.openxmlformats.org/drawingml/2006/picture">
+                  <pic:nvPicPr>
+                    <pic:cNvPr id="1" name=""/>
+                    <pic:cNvPicPr/>
+                  </pic:nvPicPr>
+                  <pic:blipFill>
+                    <a:blip r:embed="rId23"/>
+                    <a:stretch>
+                      <a:fillRect/>
+                    </a:stretch>
+                  </pic:blipFill>
+                  <pic:spPr>
+                    <a:xfrm>
+                      <a:off x="0" y="0"/>
+                      <a:ext cx="4598975" cy="1853867"/>
+                    </a:xfrm>
+                    <a:prstGeom prst="rect">
+                      <a:avLst/>
+                    </a:prstGeom>
+                  </pic:spPr>
+                </pic:pic>
+              </a:graphicData>
+            </a:graphic>
+          </wp:inline>
+        </w:drawing>
+      </w:r>
+    </w:p>
+    <w:p>
+      <w:pPr>
+        <w:spacing w:before="100" w:beforeAutospacing="1" w:after="0" w:line="240" w:lineRule="auto"/>
+        <w:jc w:val="both"/>
+        <w:rPr>
+          <w:color w:val="002060"/>
+        </w:rPr>
+      </w:pPr>
+      <w:r>
+        <w:rPr>
+          <w:b/>
+        </w:rPr>
+        <w:t>Primer despliegue en AWS:</w:t>
+      </w:r>
+      <w:r>
+        <w:t xml:space="preserve"> </w:t>
+      </w:r>
+      <w:r>
+        <w:rPr>
+          <w:color w:val="002060"/>
+        </w:rPr>
+        <w:t>Sacamos</w:t>
+      </w:r>
+      <w:r>
+        <w:rPr>
+          <w:color w:val="002060"/>
+        </w:rPr>
+        <w:t xml:space="preserve"> el proyecto de nuestro ordenador local para moverlo a internet dentro de los servidores virtuales de Amazon Web Services (AWS). Levantamos una máquina en la nube con el sistema operativo Ubuntu 24.04.4 LTS.</w:t>
+      </w:r>
+    </w:p>
+    <w:p>
+      <w:pPr>
+        <w:spacing w:before="100" w:beforeAutospacing="1" w:after="0" w:line="240" w:lineRule="auto"/>
+        <w:jc w:val="both"/>
+        <w:rPr>
+          <w:rFonts w:ascii="Times New Roman" w:eastAsia="Times New Roman" w:hAnsi="Times New Roman" w:cs="Times New Roman"/>
+          <w:noProof/>
+          <w:sz w:val="24"/>
+          <w:szCs w:val="24"/>
+          <w:lang w:eastAsia="es-ES"/>
+        </w:rPr>
+      </w:pPr>
+      <w:r>
+        <w:rPr>
+          <w:color w:val="002060"/>
+        </w:rPr>
+        <w:t>Para acceder de forma remota y segura, ejecutamos una conexión cifrada a través del protocolo SSH utilizando la clave secreta privada labsuser.pem y apuntando directamente a nuestra dirección IP pública 34.196.183.41.</w:t>
+      </w:r>
+    </w:p>
+    <w:p>
+      <w:pPr>
+        <w:spacing w:before="100" w:beforeAutospacing="1" w:after="100" w:afterAutospacing="1" w:line="240" w:lineRule="auto"/>
+        <w:rPr>
+          <w:rFonts w:ascii="Times New Roman" w:eastAsia="Times New Roman" w:hAnsi="Times New Roman" w:cs="Times New Roman"/>
+          <w:sz w:val="24"/>
+          <w:szCs w:val="24"/>
+          <w:lang w:eastAsia="es-ES"/>
+        </w:rPr>
+      </w:pPr>
+      <w:r>
+        <w:rPr>
+          <w:rFonts w:ascii="Times New Roman" w:eastAsia="Times New Roman" w:hAnsi="Times New Roman" w:cs="Times New Roman"/>
+          <w:noProof/>
+          <w:sz w:val="24"/>
+          <w:szCs w:val="24"/>
+          <w:lang w:eastAsia="es-ES"/>
+        </w:rPr>
+        <w:drawing>
+          <wp:inline distT="0" distB="0" distL="0" distR="0" wp14:anchorId="3141D073" wp14:editId="44E6A804">
+            <wp:extent cx="4356340" cy="2721503"/>
+            <wp:effectExtent l="0" t="0" r="6350" b="3175"/>
+            <wp:docPr id="10" name="Imagen 10" descr="E:\ConexionUnbuntuAWS.png"/>
+            <wp:cNvGraphicFramePr>
+              <a:graphicFrameLocks xmlns:a="http://schemas.openxmlformats.org/drawingml/2006/main" noChangeAspect="1"/>
+            </wp:cNvGraphicFramePr>
+            <a:graphic xmlns:a="http://schemas.openxmlformats.org/drawingml/2006/main">
+              <a:graphicData uri="http://schemas.openxmlformats.org/drawingml/2006/picture">
+                <pic:pic xmlns:pic="http://schemas.openxmlformats.org/drawingml/2006/picture">
+                  <pic:nvPicPr>
+                    <pic:cNvPr id="0" name="Picture 3" descr="E:\ConexionUnbuntuAWS.png"/>
+                    <pic:cNvPicPr>
+                      <a:picLocks noChangeAspect="1" noChangeArrowheads="1"/>
+                    </pic:cNvPicPr>
+                  </pic:nvPicPr>
+                  <pic:blipFill>
+                    <a:blip r:embed="rId24">
+                      <a:extLst>
+                        <a:ext uri="{28A0092B-C50C-407E-A947-70E740481C1C}">
+                          <a14:useLocalDpi xmlns:a14="http://schemas.microsoft.com/office/drawing/2010/main" val="0"/>
+                        </a:ext>
+                      </a:extLst>
+                    </a:blip>
+                    <a:srcRect/>
+                    <a:stretch>
+                      <a:fillRect/>
+                    </a:stretch>
+                  </pic:blipFill>
+                  <pic:spPr bwMode="auto">
+                    <a:xfrm>
+                      <a:off x="0" y="0"/>
+                      <a:ext cx="4404172" cy="2751385"/>
+                    </a:xfrm>
+                    <a:prstGeom prst="rect">
+                      <a:avLst/>
+                    </a:prstGeom>
+                    <a:noFill/>
+                    <a:ln>
+                      <a:noFill/>
+                    </a:ln>
+                  </pic:spPr>
+                </pic:pic>
+              </a:graphicData>
+            </a:graphic>
+          </wp:inline>
+        </w:drawing>
+      </w:r>
+      <w:bookmarkStart w:id="1" w:name="_GoBack"/>
+      <w:bookmarkEnd w:id="0"/>
+      <w:bookmarkEnd w:id="1"/>
+    </w:p>
+    <w:p>
+      <w:pPr>
+        <w:pStyle w:val="Ttulo2"/>
+      </w:pPr>
+      <w:r>
+        <w:lastRenderedPageBreak/>
+        <w:t>Informe problemas equipo</w:t>
+      </w:r>
+    </w:p>
+    <w:p>
+      <w:pPr>
+        <w:spacing w:before="240" w:after="0" w:line="240" w:lineRule="auto"/>
+        <w:jc w:val="both"/>
+        <w:rPr>
+          <w:color w:val="002060"/>
+        </w:rPr>
+      </w:pPr>
+      <w:r>
+        <w:rPr>
+          <w:b/>
+        </w:rPr>
+        <w:t>Descripción de algún problema del equipo (DIA 1):</w:t>
+      </w:r>
+      <w:r>
+        <w:t xml:space="preserve"> </w:t>
       </w:r>
       <w:r>
         <w:rPr>
@@ -1113,7 +3020,6 @@
         <w:spacing w:before="240" w:after="0" w:line="240" w:lineRule="auto"/>
         <w:jc w:val="both"/>
         <w:rPr>
-          <w:b/>
           <w:color w:val="002060"/>
         </w:rPr>
       </w:pPr>
@@ -1141,12 +3047,163 @@
         </w:rPr>
         <w:t>No hubo ningún problema</w:t>
       </w:r>
-      <w:bookmarkStart w:id="0" w:name="_GoBack"/>
-      <w:bookmarkEnd w:id="0"/>
+    </w:p>
+    <w:p>
+      <w:pPr>
+        <w:spacing w:before="240" w:after="0" w:line="240" w:lineRule="auto"/>
+        <w:jc w:val="both"/>
+        <w:rPr>
+          <w:color w:val="002060"/>
+        </w:rPr>
+      </w:pPr>
+      <w:r>
+        <w:rPr>
+          <w:b/>
+        </w:rPr>
+        <w:t xml:space="preserve">Descripción de algún problema del equipo (DIA </w:t>
+      </w:r>
+      <w:r>
+        <w:rPr>
+          <w:b/>
+        </w:rPr>
+        <w:t>3</w:t>
+      </w:r>
+      <w:r>
+        <w:rPr>
+          <w:b/>
+        </w:rPr>
+        <w:t xml:space="preserve">): </w:t>
+      </w:r>
+      <w:r>
+        <w:rPr>
+          <w:color w:val="002060"/>
+        </w:rPr>
+        <w:t>No hubo ningún problema</w:t>
+      </w:r>
+    </w:p>
+    <w:p>
+      <w:pPr>
+        <w:spacing w:before="240" w:after="0" w:line="240" w:lineRule="auto"/>
+        <w:jc w:val="both"/>
+        <w:rPr>
+          <w:color w:val="002060"/>
+        </w:rPr>
+      </w:pPr>
+      <w:r>
+        <w:rPr>
+          <w:b/>
+        </w:rPr>
+        <w:t xml:space="preserve">Descripción de algún problema del equipo (DIA </w:t>
+      </w:r>
+      <w:r>
+        <w:rPr>
+          <w:b/>
+        </w:rPr>
+        <w:t>4</w:t>
+      </w:r>
+      <w:r>
+        <w:rPr>
+          <w:b/>
+        </w:rPr>
+        <w:t xml:space="preserve">): </w:t>
+      </w:r>
+      <w:r>
+        <w:rPr>
+          <w:color w:val="002060"/>
+        </w:rPr>
+        <w:t>No hubo ningún problema</w:t>
+      </w:r>
+    </w:p>
+    <w:p>
+      <w:pPr>
+        <w:spacing w:before="240" w:after="0" w:line="240" w:lineRule="auto"/>
+        <w:jc w:val="both"/>
+        <w:rPr>
+          <w:color w:val="002060"/>
+        </w:rPr>
+      </w:pPr>
+      <w:r>
+        <w:rPr>
+          <w:b/>
+        </w:rPr>
+        <w:t xml:space="preserve">Descripción de algún problema del equipo (DIA </w:t>
+      </w:r>
+      <w:r>
+        <w:rPr>
+          <w:b/>
+        </w:rPr>
+        <w:t>5</w:t>
+      </w:r>
+      <w:r>
+        <w:rPr>
+          <w:b/>
+        </w:rPr>
+        <w:t xml:space="preserve">): </w:t>
+      </w:r>
+      <w:r>
+        <w:rPr>
+          <w:color w:val="002060"/>
+        </w:rPr>
+        <w:t>No hubo ningún problema</w:t>
+      </w:r>
+    </w:p>
+    <w:p>
+      <w:pPr>
+        <w:spacing w:before="240" w:after="0" w:line="240" w:lineRule="auto"/>
+        <w:jc w:val="both"/>
+        <w:rPr>
+          <w:b/>
+          <w:color w:val="002060"/>
+        </w:rPr>
+      </w:pPr>
+      <w:r>
+        <w:rPr>
+          <w:b/>
+        </w:rPr>
+        <w:t xml:space="preserve">Descripción de algún problema del equipo (DIA </w:t>
+      </w:r>
+      <w:r>
+        <w:rPr>
+          <w:b/>
+        </w:rPr>
+        <w:t>6</w:t>
+      </w:r>
+      <w:r>
+        <w:rPr>
+          <w:b/>
+        </w:rPr>
+        <w:t xml:space="preserve">): </w:t>
+      </w:r>
+      <w:r>
+        <w:rPr>
+          <w:color w:val="002060"/>
+        </w:rPr>
+        <w:t>No hubo ningún problema</w:t>
+      </w:r>
+    </w:p>
+    <w:p>
+      <w:pPr>
+        <w:spacing w:before="240" w:after="0" w:line="240" w:lineRule="auto"/>
+        <w:jc w:val="both"/>
+        <w:rPr>
+          <w:b/>
+          <w:color w:val="002060"/>
+        </w:rPr>
+      </w:pPr>
+    </w:p>
+    <w:p>
+      <w:pPr>
+        <w:spacing w:before="240" w:after="0" w:line="240" w:lineRule="auto"/>
+        <w:jc w:val="both"/>
+        <w:rPr>
+          <w:b/>
+          <w:color w:val="002060"/>
+        </w:rPr>
+      </w:pPr>
     </w:p>
     <w:sectPr>
-      <w:headerReference w:type="default" r:id="rId12"/>
-      <w:footerReference w:type="default" r:id="rId13"/>
+      <w:headerReference w:type="default" r:id="rId25"/>
+      <w:footerReference w:type="default" r:id="rId26"/>
       <w:pgSz w:w="11906" w:h="16838"/>
       <w:pgMar w:top="1417" w:right="1701" w:bottom="1417" w:left="1701" w:header="708" w:footer="708" w:gutter="0"/>
       <w:cols w:space="708"/>
@@ -1292,8 +3349,8 @@
     <w:pPr>
       <w:pStyle w:val="Encabezado"/>
     </w:pPr>
-    <w:bookmarkStart w:id="1" w:name="_Hlk231386841"/>
-    <w:bookmarkStart w:id="2" w:name="_Hlk231386842"/>
+    <w:bookmarkStart w:id="2" w:name="_Hlk231386841"/>
+    <w:bookmarkStart w:id="3" w:name="_Hlk231386842"/>
     <w:r>
       <w:rPr>
         <w:rStyle w:val="CitadestacadaCar"/>
@@ -1318,10 +3375,435 @@
       </w:rPr>
       <w:t>Proyecto Intermodular</w:t>
     </w:r>
-    <w:bookmarkEnd w:id="1"/>
     <w:bookmarkEnd w:id="2"/>
+    <w:bookmarkEnd w:id="3"/>
   </w:p>
 </w:hdr>
+</file>
+
+<file path=word/numbering.xml><?xml version="1.0" encoding="utf-8"?>
+<w:numbering xmlns:wpc="http://schemas.microsoft.com/office/word/2010/wordprocessingCanvas" xmlns:cx="http://schemas.microsoft.com/office/drawing/2014/chartex" xmlns:cx1="http://schemas.microsoft.com/office/drawing/2015/9/8/chartex" xmlns:cx2="http://schemas.microsoft.com/office/drawing/2015/10/21/chartex" xmlns:cx3="http://schemas.microsoft.com/office/drawing/2016/5/9/chartex" xmlns:cx4="http://schemas.microsoft.com/office/drawing/2016/5/10/chartex" xmlns:cx5="http://schemas.microsoft.com/office/drawing/2016/5/11/chartex" xmlns:cx6="http://schemas.microsoft.com/office/drawing/2016/5/12/chartex" xmlns:cx7="http://schemas.microsoft.com/office/drawing/2016/5/13/chartex" xmlns:cx8="http://schemas.microsoft.com/office/drawing/2016/5/14/chartex" xmlns:mc="http://schemas.openxmlformats.org/markup-compatibility/2006" xmlns:aink="http://schemas.microsoft.com/office/drawing/2016/ink" xmlns:am3d="http://schemas.microsoft.com/office/drawing/2017/model3d" xmlns:o="urn:schemas-microsoft-com:office:office" xmlns:r="http://schemas.openxmlformats.org/officeDocument/2006/relationships" xmlns:m="http://schemas.openxmlformats.org/officeDocument/2006/math" xmlns:v="urn:schemas-microsoft-com:vml" xmlns:wp14="http://schemas.microsoft.com/office/word/2010/wordprocessingDrawing" xmlns:wp="http://schemas.openxmlformats.org/drawingml/2006/wordprocessingDrawing" xmlns:w10="urn:schemas-microsoft-com:office:word" xmlns:w="http://schemas.openxmlformats.org/wordprocessingml/2006/main" xmlns:w14="http://schemas.microsoft.com/office/word/2010/wordml" xmlns:w15="http://schemas.microsoft.com/office/word/2012/wordml" xmlns:w16cid="http://schemas.microsoft.com/office/word/2016/wordml/cid" xmlns:w16se="http://schemas.microsoft.com/office/word/2015/wordml/symex" xmlns:wpg="http://schemas.microsoft.com/office/word/2010/wordprocessingGroup" xmlns:wpi="http://schemas.microsoft.com/office/word/2010/wordprocessingInk" xmlns:wne="http://schemas.microsoft.com/office/word/2006/wordml" xmlns:wps="http://schemas.microsoft.com/office/word/2010/wordprocessingShape" mc:Ignorable="w14 w15 w16se w16cid wp14">
+  <w:abstractNum w:abstractNumId="0" w15:restartNumberingAfterBreak="0">
+    <w:nsid w:val="27094186"/>
+    <w:multiLevelType w:val="multilevel"/>
+    <w:tmpl w:val="C19608AE"/>
+    <w:lvl w:ilvl="0">
+      <w:start w:val="1"/>
+      <w:numFmt w:val="bullet"/>
+      <w:lvlText w:val=""/>
+      <w:lvlJc w:val="left"/>
+      <w:pPr>
+        <w:tabs>
+          <w:tab w:val="num" w:pos="720"/>
+        </w:tabs>
+        <w:ind w:left="720" w:hanging="360"/>
+      </w:pPr>
+      <w:rPr>
+        <w:rFonts w:ascii="Symbol" w:hAnsi="Symbol" w:hint="default"/>
+        <w:sz w:val="20"/>
+      </w:rPr>
+    </w:lvl>
+    <w:lvl w:ilvl="1">
+      <w:start w:val="1"/>
+      <w:numFmt w:val="bullet"/>
+      <w:lvlText w:val="o"/>
+      <w:lvlJc w:val="left"/>
+      <w:pPr>
+        <w:tabs>
+          <w:tab w:val="num" w:pos="1440"/>
+        </w:tabs>
+        <w:ind w:left="1440" w:hanging="360"/>
+      </w:pPr>
+      <w:rPr>
+        <w:rFonts w:ascii="Courier New" w:hAnsi="Courier New" w:hint="default"/>
+        <w:sz w:val="20"/>
+      </w:rPr>
+    </w:lvl>
+    <w:lvl w:ilvl="2" w:tentative="1">
+      <w:start w:val="1"/>
+      <w:numFmt w:val="bullet"/>
+      <w:lvlText w:val=""/>
+      <w:lvlJc w:val="left"/>
+      <w:pPr>
+        <w:tabs>
+          <w:tab w:val="num" w:pos="2160"/>
+        </w:tabs>
+        <w:ind w:left="2160" w:hanging="360"/>
+      </w:pPr>
+      <w:rPr>
+        <w:rFonts w:ascii="Wingdings" w:hAnsi="Wingdings" w:hint="default"/>
+        <w:sz w:val="20"/>
+      </w:rPr>
+    </w:lvl>
+    <w:lvl w:ilvl="3" w:tentative="1">
+      <w:start w:val="1"/>
+      <w:numFmt w:val="bullet"/>
+      <w:lvlText w:val=""/>
+      <w:lvlJc w:val="left"/>
+      <w:pPr>
+        <w:tabs>
+          <w:tab w:val="num" w:pos="2880"/>
+        </w:tabs>
+        <w:ind w:left="2880" w:hanging="360"/>
+      </w:pPr>
+      <w:rPr>
+        <w:rFonts w:ascii="Wingdings" w:hAnsi="Wingdings" w:hint="default"/>
+        <w:sz w:val="20"/>
+      </w:rPr>
+    </w:lvl>
+    <w:lvl w:ilvl="4" w:tentative="1">
+      <w:start w:val="1"/>
+      <w:numFmt w:val="bullet"/>
+      <w:lvlText w:val=""/>
+      <w:lvlJc w:val="left"/>
+      <w:pPr>
+        <w:tabs>
+          <w:tab w:val="num" w:pos="3600"/>
+        </w:tabs>
+        <w:ind w:left="3600" w:hanging="360"/>
+      </w:pPr>
+      <w:rPr>
+        <w:rFonts w:ascii="Wingdings" w:hAnsi="Wingdings" w:hint="default"/>
+        <w:sz w:val="20"/>
+      </w:rPr>
+    </w:lvl>
+    <w:lvl w:ilvl="5" w:tentative="1">
+      <w:start w:val="1"/>
+      <w:numFmt w:val="bullet"/>
+      <w:lvlText w:val=""/>
+      <w:lvlJc w:val="left"/>
+      <w:pPr>
+        <w:tabs>
+          <w:tab w:val="num" w:pos="4320"/>
+        </w:tabs>
+        <w:ind w:left="4320" w:hanging="360"/>
+      </w:pPr>
+      <w:rPr>
+        <w:rFonts w:ascii="Wingdings" w:hAnsi="Wingdings" w:hint="default"/>
+        <w:sz w:val="20"/>
+      </w:rPr>
+    </w:lvl>
+    <w:lvl w:ilvl="6" w:tentative="1">
+      <w:start w:val="1"/>
+      <w:numFmt w:val="bullet"/>
+      <w:lvlText w:val=""/>
+      <w:lvlJc w:val="left"/>
+      <w:pPr>
+        <w:tabs>
+          <w:tab w:val="num" w:pos="5040"/>
+        </w:tabs>
+        <w:ind w:left="5040" w:hanging="360"/>
+      </w:pPr>
+      <w:rPr>
+        <w:rFonts w:ascii="Wingdings" w:hAnsi="Wingdings" w:hint="default"/>
+        <w:sz w:val="20"/>
+      </w:rPr>
+    </w:lvl>
+    <w:lvl w:ilvl="7" w:tentative="1">
+      <w:start w:val="1"/>
+      <w:numFmt w:val="bullet"/>
+      <w:lvlText w:val=""/>
+      <w:lvlJc w:val="left"/>
+      <w:pPr>
+        <w:tabs>
+          <w:tab w:val="num" w:pos="5760"/>
+        </w:tabs>
+        <w:ind w:left="5760" w:hanging="360"/>
+      </w:pPr>
+      <w:rPr>
+        <w:rFonts w:ascii="Wingdings" w:hAnsi="Wingdings" w:hint="default"/>
+        <w:sz w:val="20"/>
+      </w:rPr>
+    </w:lvl>
+    <w:lvl w:ilvl="8" w:tentative="1">
+      <w:start w:val="1"/>
+      <w:numFmt w:val="bullet"/>
+      <w:lvlText w:val=""/>
+      <w:lvlJc w:val="left"/>
+      <w:pPr>
+        <w:tabs>
+          <w:tab w:val="num" w:pos="6480"/>
+        </w:tabs>
+        <w:ind w:left="6480" w:hanging="360"/>
+      </w:pPr>
+      <w:rPr>
+        <w:rFonts w:ascii="Wingdings" w:hAnsi="Wingdings" w:hint="default"/>
+        <w:sz w:val="20"/>
+      </w:rPr>
+    </w:lvl>
+  </w:abstractNum>
+  <w:abstractNum w:abstractNumId="1" w15:restartNumberingAfterBreak="0">
+    <w:nsid w:val="3B586FD0"/>
+    <w:multiLevelType w:val="multilevel"/>
+    <w:tmpl w:val="9B6647F8"/>
+    <w:lvl w:ilvl="0">
+      <w:start w:val="1"/>
+      <w:numFmt w:val="bullet"/>
+      <w:lvlText w:val=""/>
+      <w:lvlJc w:val="left"/>
+      <w:pPr>
+        <w:tabs>
+          <w:tab w:val="num" w:pos="720"/>
+        </w:tabs>
+        <w:ind w:left="720" w:hanging="360"/>
+      </w:pPr>
+      <w:rPr>
+        <w:rFonts w:ascii="Symbol" w:hAnsi="Symbol" w:hint="default"/>
+        <w:sz w:val="20"/>
+      </w:rPr>
+    </w:lvl>
+    <w:lvl w:ilvl="1" w:tentative="1">
+      <w:start w:val="1"/>
+      <w:numFmt w:val="bullet"/>
+      <w:lvlText w:val="o"/>
+      <w:lvlJc w:val="left"/>
+      <w:pPr>
+        <w:tabs>
+          <w:tab w:val="num" w:pos="1440"/>
+        </w:tabs>
+        <w:ind w:left="1440" w:hanging="360"/>
+      </w:pPr>
+      <w:rPr>
+        <w:rFonts w:ascii="Courier New" w:hAnsi="Courier New" w:hint="default"/>
+        <w:sz w:val="20"/>
+      </w:rPr>
+    </w:lvl>
+    <w:lvl w:ilvl="2" w:tentative="1">
+      <w:start w:val="1"/>
+      <w:numFmt w:val="bullet"/>
+      <w:lvlText w:val=""/>
+      <w:lvlJc w:val="left"/>
+      <w:pPr>
+        <w:tabs>
+          <w:tab w:val="num" w:pos="2160"/>
+        </w:tabs>
+        <w:ind w:left="2160" w:hanging="360"/>
+      </w:pPr>
+      <w:rPr>
+        <w:rFonts w:ascii="Wingdings" w:hAnsi="Wingdings" w:hint="default"/>
+        <w:sz w:val="20"/>
+      </w:rPr>
+    </w:lvl>
+    <w:lvl w:ilvl="3" w:tentative="1">
+      <w:start w:val="1"/>
+      <w:numFmt w:val="bullet"/>
+      <w:lvlText w:val=""/>
+      <w:lvlJc w:val="left"/>
+      <w:pPr>
+        <w:tabs>
+          <w:tab w:val="num" w:pos="2880"/>
+        </w:tabs>
+        <w:ind w:left="2880" w:hanging="360"/>
+      </w:pPr>
+      <w:rPr>
+        <w:rFonts w:ascii="Wingdings" w:hAnsi="Wingdings" w:hint="default"/>
+        <w:sz w:val="20"/>
+      </w:rPr>
+    </w:lvl>
+    <w:lvl w:ilvl="4" w:tentative="1">
+      <w:start w:val="1"/>
+      <w:numFmt w:val="bullet"/>
+      <w:lvlText w:val=""/>
+      <w:lvlJc w:val="left"/>
+      <w:pPr>
+        <w:tabs>
+          <w:tab w:val="num" w:pos="3600"/>
+        </w:tabs>
+        <w:ind w:left="3600" w:hanging="360"/>
+      </w:pPr>
+      <w:rPr>
+        <w:rFonts w:ascii="Wingdings" w:hAnsi="Wingdings" w:hint="default"/>
+        <w:sz w:val="20"/>
+      </w:rPr>
+    </w:lvl>
+    <w:lvl w:ilvl="5" w:tentative="1">
+      <w:start w:val="1"/>
+      <w:numFmt w:val="bullet"/>
+      <w:lvlText w:val=""/>
+      <w:lvlJc w:val="left"/>
+      <w:pPr>
+        <w:tabs>
+          <w:tab w:val="num" w:pos="4320"/>
+        </w:tabs>
+        <w:ind w:left="4320" w:hanging="360"/>
+      </w:pPr>
+      <w:rPr>
+        <w:rFonts w:ascii="Wingdings" w:hAnsi="Wingdings" w:hint="default"/>
+        <w:sz w:val="20"/>
+      </w:rPr>
+    </w:lvl>
+    <w:lvl w:ilvl="6" w:tentative="1">
+      <w:start w:val="1"/>
+      <w:numFmt w:val="bullet"/>
+      <w:lvlText w:val=""/>
+      <w:lvlJc w:val="left"/>
+      <w:pPr>
+        <w:tabs>
+          <w:tab w:val="num" w:pos="5040"/>
+        </w:tabs>
+        <w:ind w:left="5040" w:hanging="360"/>
+      </w:pPr>
+      <w:rPr>
+        <w:rFonts w:ascii="Wingdings" w:hAnsi="Wingdings" w:hint="default"/>
+        <w:sz w:val="20"/>
+      </w:rPr>
+    </w:lvl>
+    <w:lvl w:ilvl="7" w:tentative="1">
+      <w:start w:val="1"/>
+      <w:numFmt w:val="bullet"/>
+      <w:lvlText w:val=""/>
+      <w:lvlJc w:val="left"/>
+      <w:pPr>
+        <w:tabs>
+          <w:tab w:val="num" w:pos="5760"/>
+        </w:tabs>
+        <w:ind w:left="5760" w:hanging="360"/>
+      </w:pPr>
+      <w:rPr>
+        <w:rFonts w:ascii="Wingdings" w:hAnsi="Wingdings" w:hint="default"/>
+        <w:sz w:val="20"/>
+      </w:rPr>
+    </w:lvl>
+    <w:lvl w:ilvl="8" w:tentative="1">
+      <w:start w:val="1"/>
+      <w:numFmt w:val="bullet"/>
+      <w:lvlText w:val=""/>
+      <w:lvlJc w:val="left"/>
+      <w:pPr>
+        <w:tabs>
+          <w:tab w:val="num" w:pos="6480"/>
+        </w:tabs>
+        <w:ind w:left="6480" w:hanging="360"/>
+      </w:pPr>
+      <w:rPr>
+        <w:rFonts w:ascii="Wingdings" w:hAnsi="Wingdings" w:hint="default"/>
+        <w:sz w:val="20"/>
+      </w:rPr>
+    </w:lvl>
+  </w:abstractNum>
+  <w:abstractNum w:abstractNumId="2" w15:restartNumberingAfterBreak="0">
+    <w:nsid w:val="577A1FDF"/>
+    <w:multiLevelType w:val="hybridMultilevel"/>
+    <w:tmpl w:val="D834EE04"/>
+    <w:lvl w:ilvl="0" w:tplc="0C0A0001">
+      <w:start w:val="1"/>
+      <w:numFmt w:val="bullet"/>
+      <w:lvlText w:val=""/>
+      <w:lvlJc w:val="left"/>
+      <w:pPr>
+        <w:ind w:left="720" w:hanging="360"/>
+      </w:pPr>
+      <w:rPr>
+        <w:rFonts w:ascii="Symbol" w:hAnsi="Symbol" w:hint="default"/>
+      </w:rPr>
+    </w:lvl>
+    <w:lvl w:ilvl="1" w:tplc="0C0A0003" w:tentative="1">
+      <w:start w:val="1"/>
+      <w:numFmt w:val="bullet"/>
+      <w:lvlText w:val="o"/>
+      <w:lvlJc w:val="left"/>
+      <w:pPr>
+        <w:ind w:left="1440" w:hanging="360"/>
+      </w:pPr>
+      <w:rPr>
+        <w:rFonts w:ascii="Courier New" w:hAnsi="Courier New" w:cs="Courier New" w:hint="default"/>
+      </w:rPr>
+    </w:lvl>
+    <w:lvl w:ilvl="2" w:tplc="0C0A0005" w:tentative="1">
+      <w:start w:val="1"/>
+      <w:numFmt w:val="bullet"/>
+      <w:lvlText w:val=""/>
+      <w:lvlJc w:val="left"/>
+      <w:pPr>
+        <w:ind w:left="2160" w:hanging="360"/>
+      </w:pPr>
+      <w:rPr>
+        <w:rFonts w:ascii="Wingdings" w:hAnsi="Wingdings" w:hint="default"/>
+      </w:rPr>
+    </w:lvl>
+    <w:lvl w:ilvl="3" w:tplc="0C0A0001" w:tentative="1">
+      <w:start w:val="1"/>
+      <w:numFmt w:val="bullet"/>
+      <w:lvlText w:val=""/>
+      <w:lvlJc w:val="left"/>
+      <w:pPr>
+        <w:ind w:left="2880" w:hanging="360"/>
+      </w:pPr>
+      <w:rPr>
+        <w:rFonts w:ascii="Symbol" w:hAnsi="Symbol" w:hint="default"/>
+      </w:rPr>
+    </w:lvl>
+    <w:lvl w:ilvl="4" w:tplc="0C0A0003" w:tentative="1">
+      <w:start w:val="1"/>
+      <w:numFmt w:val="bullet"/>
+      <w:lvlText w:val="o"/>
+      <w:lvlJc w:val="left"/>
+      <w:pPr>
+        <w:ind w:left="3600" w:hanging="360"/>
+      </w:pPr>
+      <w:rPr>
+        <w:rFonts w:ascii="Courier New" w:hAnsi="Courier New" w:cs="Courier New" w:hint="default"/>
+      </w:rPr>
+    </w:lvl>
+    <w:lvl w:ilvl="5" w:tplc="0C0A0005" w:tentative="1">
+      <w:start w:val="1"/>
+      <w:numFmt w:val="bullet"/>
+      <w:lvlText w:val=""/>
+      <w:lvlJc w:val="left"/>
+      <w:pPr>
+        <w:ind w:left="4320" w:hanging="360"/>
+      </w:pPr>
+      <w:rPr>
+        <w:rFonts w:ascii="Wingdings" w:hAnsi="Wingdings" w:hint="default"/>
+      </w:rPr>
+    </w:lvl>
+    <w:lvl w:ilvl="6" w:tplc="0C0A0001" w:tentative="1">
+      <w:start w:val="1"/>
+      <w:numFmt w:val="bullet"/>
+      <w:lvlText w:val=""/>
+      <w:lvlJc w:val="left"/>
+      <w:pPr>
+        <w:ind w:left="5040" w:hanging="360"/>
+      </w:pPr>
+      <w:rPr>
+        <w:rFonts w:ascii="Symbol" w:hAnsi="Symbol" w:hint="default"/>
+      </w:rPr>
+    </w:lvl>
+    <w:lvl w:ilvl="7" w:tplc="0C0A0003" w:tentative="1">
+      <w:start w:val="1"/>
+      <w:numFmt w:val="bullet"/>
+      <w:lvlText w:val="o"/>
+      <w:lvlJc w:val="left"/>
+      <w:pPr>
+        <w:ind w:left="5760" w:hanging="360"/>
+      </w:pPr>
+      <w:rPr>
+        <w:rFonts w:ascii="Courier New" w:hAnsi="Courier New" w:cs="Courier New" w:hint="default"/>
+      </w:rPr>
+    </w:lvl>
+    <w:lvl w:ilvl="8" w:tplc="0C0A0005" w:tentative="1">
+      <w:start w:val="1"/>
+      <w:numFmt w:val="bullet"/>
+      <w:lvlText w:val=""/>
+      <w:lvlJc w:val="left"/>
+      <w:pPr>
+        <w:ind w:left="6480" w:hanging="360"/>
+      </w:pPr>
+      <w:rPr>
+        <w:rFonts w:ascii="Wingdings" w:hAnsi="Wingdings" w:hint="default"/>
+      </w:rPr>
+    </w:lvl>
+  </w:abstractNum>
+  <w:num w:numId="1">
+    <w:abstractNumId w:val="2"/>
+  </w:num>
+  <w:num w:numId="2">
+    <w:abstractNumId w:val="1"/>
+  </w:num>
+  <w:num w:numId="3">
+    <w:abstractNumId w:val="0"/>
+  </w:num>
+</w:numbering>
 </file>
 
 <file path=word/styles.xml><?xml version="1.0" encoding="utf-8"?>
@@ -1771,7 +4253,6 @@
     <w:next w:val="Normal"/>
     <w:link w:val="Ttulo3Car"/>
     <w:uiPriority w:val="9"/>
-    <w:semiHidden/>
     <w:unhideWhenUsed/>
     <w:qFormat/>
     <w:rsid w:val="009935ED"/>
@@ -1833,7 +4314,6 @@
     <w:basedOn w:val="Fuentedeprrafopredeter"/>
     <w:link w:val="Ttulo3"/>
     <w:uiPriority w:val="9"/>
-    <w:semiHidden/>
     <w:rsid w:val="009935ED"/>
     <w:rPr>
       <w:rFonts w:asciiTheme="majorHAnsi" w:eastAsiaTheme="majorEastAsia" w:hAnsiTheme="majorHAnsi" w:cstheme="majorBidi"/>
@@ -2047,6 +4527,47 @@
       <w:color w:val="954F72" w:themeColor="followedHyperlink"/>
       <w:u w:val="single"/>
     </w:rPr>
+  </w:style>
+  <w:style w:type="paragraph" w:styleId="NormalWeb">
+    <w:name w:val="Normal (Web)"/>
+    <w:basedOn w:val="Normal"/>
+    <w:uiPriority w:val="99"/>
+    <w:semiHidden/>
+    <w:unhideWhenUsed/>
+    <w:rsid w:val="001B5CBB"/>
+    <w:pPr>
+      <w:spacing w:before="100" w:beforeAutospacing="1" w:after="100" w:afterAutospacing="1" w:line="240" w:lineRule="auto"/>
+    </w:pPr>
+    <w:rPr>
+      <w:rFonts w:ascii="Times New Roman" w:eastAsia="Times New Roman" w:hAnsi="Times New Roman" w:cs="Times New Roman"/>
+      <w:sz w:val="24"/>
+      <w:szCs w:val="24"/>
+      <w:lang w:eastAsia="es-ES"/>
+    </w:rPr>
+  </w:style>
+  <w:style w:type="character" w:styleId="CdigoHTML">
+    <w:name w:val="HTML Code"/>
+    <w:basedOn w:val="Fuentedeprrafopredeter"/>
+    <w:uiPriority w:val="99"/>
+    <w:semiHidden/>
+    <w:unhideWhenUsed/>
+    <w:rsid w:val="001B5CBB"/>
+    <w:rPr>
+      <w:rFonts w:ascii="Courier New" w:eastAsia="Times New Roman" w:hAnsi="Courier New" w:cs="Courier New"/>
+      <w:sz w:val="20"/>
+      <w:szCs w:val="20"/>
+    </w:rPr>
+  </w:style>
+  <w:style w:type="paragraph" w:styleId="Prrafodelista">
+    <w:name w:val="List Paragraph"/>
+    <w:basedOn w:val="Normal"/>
+    <w:uiPriority w:val="34"/>
+    <w:qFormat/>
+    <w:rsid w:val="001B5CBB"/>
+    <w:pPr>
+      <w:ind w:left="720"/>
+      <w:contextualSpacing/>
+    </w:pPr>
   </w:style>
 </w:styles>
 </file>
@@ -2351,7 +4872,7 @@
 </file>
 
 <file path=customXml/itemProps1.xml><?xml version="1.0" encoding="utf-8"?>
-<ds:datastoreItem xmlns:ds="http://schemas.openxmlformats.org/officeDocument/2006/customXml" ds:itemID="{A674E1D3-62F3-4103-8011-B6373596F7D6}">
+<ds:datastoreItem xmlns:ds="http://schemas.openxmlformats.org/officeDocument/2006/customXml" ds:itemID="{69A4C7BA-C302-4530-967E-573FAFC9EDA6}">
   <ds:schemaRefs>
     <ds:schemaRef ds:uri="http://schemas.openxmlformats.org/officeDocument/2006/bibliography"/>
   </ds:schemaRefs>

</xml_diff>

<commit_message>
Cambios y mejoras en la memoria borrador
</commit_message>
<xml_diff>
--- a/Documentacion/Proyecto Intermodular.docx
+++ b/Documentacion/Proyecto Intermodular.docx
@@ -2824,6 +2824,7 @@
       <w:r>
         <w:rPr>
           <w:b/>
+          <w:noProof/>
         </w:rPr>
         <w:drawing>
           <wp:inline distT="0" distB="0" distL="0" distR="0" wp14:anchorId="5A8E2025" wp14:editId="697CA847">
@@ -2978,9 +2979,7 @@
           </wp:inline>
         </w:drawing>
       </w:r>
-      <w:bookmarkStart w:id="1" w:name="_GoBack"/>
       <w:bookmarkEnd w:id="0"/>
-      <w:bookmarkEnd w:id="1"/>
     </w:p>
     <w:p>
       <w:pPr>
@@ -2990,6 +2989,10 @@
         <w:lastRenderedPageBreak/>
         <w:t>Informe problemas equipo</w:t>
       </w:r>
+    </w:p>
+    <w:p>
+      <w:bookmarkStart w:id="1" w:name="_GoBack"/>
+      <w:bookmarkEnd w:id="1"/>
     </w:p>
     <w:p>
       <w:pPr>
@@ -4872,7 +4875,7 @@
 </file>
 
 <file path=customXml/itemProps1.xml><?xml version="1.0" encoding="utf-8"?>
-<ds:datastoreItem xmlns:ds="http://schemas.openxmlformats.org/officeDocument/2006/customXml" ds:itemID="{69A4C7BA-C302-4530-967E-573FAFC9EDA6}">
+<ds:datastoreItem xmlns:ds="http://schemas.openxmlformats.org/officeDocument/2006/customXml" ds:itemID="{45C68621-EA5D-45E1-8217-812CCF0735CD}">
   <ds:schemaRefs>
     <ds:schemaRef ds:uri="http://schemas.openxmlformats.org/officeDocument/2006/bibliography"/>
   </ds:schemaRefs>

</xml_diff>